<commit_message>
diagramas/casos de uso 4 criticos
</commit_message>
<xml_diff>
--- a/3.-DOCUMENTACION/2.-CU_MesaPass/5.-Gestión de Acuerdos/CU013_CrearAcuerdoEmpresaRestaurante.docx
+++ b/3.-DOCUMENTACION/2.-CU_MesaPass/5.-Gestión de Acuerdos/CU013_CrearAcuerdoEmpresaRestaurante.docx
@@ -115,16 +115,13 @@
     <w:p>
       <w:pPr>
         <w:jc w:val="right"/>
-      </w:pPr>
-      <w:r>
         <w:rPr>
           <w:rFonts w:cs="Arial"/>
           <w:i/>
           <w:iCs/>
           <w:sz w:val="32"/>
         </w:rPr>
-        <w:t xml:space="preserve">Registrar Consumo de </w:t>
-      </w:r>
+      </w:pPr>
       <w:r>
         <w:rPr>
           <w:rFonts w:cs="Arial"/>
@@ -132,7 +129,7 @@
           <w:iCs/>
           <w:sz w:val="32"/>
         </w:rPr>
-        <w:t>mediante QR</w:t>
+        <w:t>Crear Acuerdo Empresa – Restaurante</w:t>
       </w:r>
     </w:p>
     <w:p>
@@ -570,13 +567,7 @@
               <w:rPr>
                 <w:sz w:val="18"/>
               </w:rPr>
-              <w:t xml:space="preserve">Registrar Consumo de </w:t>
-            </w:r>
-            <w:r>
-              <w:rPr>
-                <w:sz w:val="18"/>
-              </w:rPr>
-              <w:t>mediante Código QR</w:t>
+              <w:t>Crear Acuerdo Empresa – Restaurante</w:t>
             </w:r>
           </w:p>
         </w:tc>
@@ -636,6 +627,12 @@
                 <w:sz w:val="18"/>
               </w:rPr>
               <w:instrText xml:space="preserve"> \* MERGEFORMAT </w:instrText>
+            </w:r>
+            <w:r>
+              <w:rPr>
+                <w:smallCaps/>
+                <w:sz w:val="18"/>
+              </w:rPr>
             </w:r>
             <w:r>
               <w:rPr>
@@ -4818,7 +4815,7 @@
       <w:bookmarkStart w:id="1" w:name="_Toc425054504"/>
       <w:bookmarkStart w:id="2" w:name="_Toc423410238"/>
       <w:r>
-        <w:t>Registrar Consumo de mediante QR</w:t>
+        <w:t>Crear Acuerdo Empresa – Restaurante</w:t>
       </w:r>
       <w:bookmarkEnd w:id="0"/>
     </w:p>
@@ -4864,21 +4861,13 @@
         <w:rPr>
           <w:color w:val="000000"/>
         </w:rPr>
-        <w:t xml:space="preserve">Permite registrar de forma automática el consumo de comida de un empleado mediante la validación de un código QR en el sistema </w:t>
-      </w:r>
-      <w:proofErr w:type="spellStart"/>
+        <w:t>Este caso de uso describe el proceso mediante el cual se crea un convenio (acuerdo) entre una empresa y un restaurante dentro del sistema MesaPass. Este acuerdo define las condiciones bajo las cuales los empleados de una empresa pueden consumir servicios de alimentación en un restaurante específico. El convenio incluye parámetros como fechas de vigencia, tipo de pago (prepago, postpago o mixto) y reglas de consumo. Este proceso es fundamental, ya que habilita el registro de consumos mediante código QR y garantiza el control financiero y operativo del sistema</w:t>
+      </w:r>
       <w:r>
         <w:rPr>
           <w:color w:val="000000"/>
         </w:rPr>
-        <w:t>MesaPass</w:t>
-      </w:r>
-      <w:proofErr w:type="spellEnd"/>
-      <w:r>
-        <w:rPr>
-          <w:color w:val="000000"/>
-        </w:rPr>
-        <w:t>. El proceso es ejecutado por el restaurante dentro de la plataforma, donde el sistema valida la información del empleado, verifica la existencia de un convenio activo y registra el consumo en la base de datos.</w:t>
+        <w:t>.</w:t>
       </w:r>
     </w:p>
     <w:p>
@@ -4900,6 +4889,36 @@
       <w:r>
         <w:t xml:space="preserve">   </w:t>
       </w:r>
+    </w:p>
+    <w:p>
+      <w:pPr>
+        <w:pStyle w:val="Textoindependiente"/>
+        <w:rPr>
+          <w:b/>
+          <w:color w:val="000000"/>
+          <w:lang w:val="es-ES" w:eastAsia="en-US"/>
+        </w:rPr>
+      </w:pPr>
+      <w:bookmarkStart w:id="9" w:name="_Toc296587026"/>
+      <w:r>
+        <w:rPr>
+          <w:b/>
+          <w:color w:val="000000"/>
+          <w:lang w:val="es-ES" w:eastAsia="en-US"/>
+        </w:rPr>
+        <w:t>En esta sección se presentan los conceptos clave relacionados con la creación de acuerdos dentro del sistema.</w:t>
+      </w:r>
+    </w:p>
+    <w:p>
+      <w:pPr>
+        <w:pStyle w:val="Textoindependiente"/>
+        <w:ind w:left="1145"/>
+        <w:rPr>
+          <w:b/>
+          <w:color w:val="000000"/>
+          <w:lang w:val="es-ES" w:eastAsia="en-US"/>
+        </w:rPr>
+      </w:pPr>
     </w:p>
     <w:p>
       <w:pPr>
@@ -4909,25 +4928,18 @@
           <w:numId w:val="5"/>
         </w:numPr>
         <w:rPr>
-          <w:color w:val="000000"/>
-          <w:lang w:val="es-ES" w:eastAsia="en-US"/>
-        </w:rPr>
-      </w:pPr>
-      <w:bookmarkStart w:id="9" w:name="_Toc296587026"/>
-      <w:r>
-        <w:rPr>
           <w:b/>
           <w:color w:val="000000"/>
           <w:lang w:val="es-ES" w:eastAsia="en-US"/>
         </w:rPr>
-        <w:t>QR:</w:t>
-      </w:r>
-      <w:r>
-        <w:rPr>
+      </w:pPr>
+      <w:r>
+        <w:rPr>
+          <w:b/>
           <w:color w:val="000000"/>
           <w:lang w:val="es-ES" w:eastAsia="en-US"/>
         </w:rPr>
-        <w:t xml:space="preserve"> Código de respuesta rápida utilizado para identificar al empleado</w:t>
+        <w:t>Convenio / Acuerdo: Relación contractual entre empresa y restaurante</w:t>
       </w:r>
     </w:p>
     <w:p>
@@ -4938,24 +4950,18 @@
           <w:numId w:val="5"/>
         </w:numPr>
         <w:rPr>
-          <w:color w:val="000000"/>
-          <w:lang w:val="es-ES" w:eastAsia="en-US"/>
-        </w:rPr>
-      </w:pPr>
-      <w:r>
-        <w:rPr>
           <w:b/>
           <w:color w:val="000000"/>
           <w:lang w:val="es-ES" w:eastAsia="en-US"/>
         </w:rPr>
-        <w:t>Convenio:</w:t>
-      </w:r>
-      <w:r>
-        <w:rPr>
+      </w:pPr>
+      <w:r>
+        <w:rPr>
+          <w:b/>
           <w:color w:val="000000"/>
           <w:lang w:val="es-ES" w:eastAsia="en-US"/>
         </w:rPr>
-        <w:t xml:space="preserve"> Acuerdo entre una empresa y un restaurante que define condiciones de consumo</w:t>
+        <w:t>Empresa: Organización que permite a sus empleados consumir servicios</w:t>
       </w:r>
     </w:p>
     <w:p>
@@ -4966,24 +4972,18 @@
           <w:numId w:val="5"/>
         </w:numPr>
         <w:rPr>
-          <w:color w:val="000000"/>
-          <w:lang w:val="es-ES" w:eastAsia="en-US"/>
-        </w:rPr>
-      </w:pPr>
-      <w:r>
-        <w:rPr>
           <w:b/>
           <w:color w:val="000000"/>
           <w:lang w:val="es-ES" w:eastAsia="en-US"/>
         </w:rPr>
-        <w:t>Consumo:</w:t>
-      </w:r>
-      <w:r>
-        <w:rPr>
+      </w:pPr>
+      <w:r>
+        <w:rPr>
+          <w:b/>
           <w:color w:val="000000"/>
           <w:lang w:val="es-ES" w:eastAsia="en-US"/>
         </w:rPr>
-        <w:t xml:space="preserve"> Registro de una comida realizada por un empleado</w:t>
+        <w:t>Restaurante: Proveedor de servicios de alimentación</w:t>
       </w:r>
     </w:p>
     <w:p>
@@ -4994,24 +4994,18 @@
           <w:numId w:val="5"/>
         </w:numPr>
         <w:rPr>
-          <w:color w:val="000000"/>
-          <w:lang w:val="es-ES" w:eastAsia="en-US"/>
-        </w:rPr>
-      </w:pPr>
-      <w:r>
-        <w:rPr>
           <w:b/>
           <w:color w:val="000000"/>
           <w:lang w:val="es-ES" w:eastAsia="en-US"/>
         </w:rPr>
-        <w:t>RUC:</w:t>
-      </w:r>
-      <w:r>
-        <w:rPr>
+      </w:pPr>
+      <w:r>
+        <w:rPr>
+          <w:b/>
           <w:color w:val="000000"/>
           <w:lang w:val="es-ES" w:eastAsia="en-US"/>
         </w:rPr>
-        <w:t xml:space="preserve"> Registro Único de Contribuyentes de una empresa</w:t>
+        <w:t>Vigencia: Período de tiempo en el que el acuerdo es válido</w:t>
       </w:r>
     </w:p>
     <w:p>
@@ -5022,24 +5016,18 @@
           <w:numId w:val="5"/>
         </w:numPr>
         <w:rPr>
-          <w:color w:val="000000"/>
-          <w:lang w:val="es-ES" w:eastAsia="en-US"/>
-        </w:rPr>
-      </w:pPr>
-      <w:r>
-        <w:rPr>
           <w:b/>
           <w:color w:val="000000"/>
           <w:lang w:val="es-ES" w:eastAsia="en-US"/>
         </w:rPr>
-        <w:t>Empleado:</w:t>
-      </w:r>
-      <w:r>
-        <w:rPr>
+      </w:pPr>
+      <w:r>
+        <w:rPr>
+          <w:b/>
           <w:color w:val="000000"/>
           <w:lang w:val="es-ES" w:eastAsia="en-US"/>
         </w:rPr>
-        <w:t xml:space="preserve"> Usuario registrado que consume servicios de alimentación</w:t>
+        <w:t>Tipo de convenio: Modalidad de pago (prepago, postpago, mixto)</w:t>
       </w:r>
     </w:p>
     <w:p>
@@ -5050,24 +5038,18 @@
           <w:numId w:val="5"/>
         </w:numPr>
         <w:rPr>
-          <w:color w:val="000000"/>
-          <w:lang w:val="es-ES" w:eastAsia="en-US"/>
-        </w:rPr>
-      </w:pPr>
-      <w:r>
-        <w:rPr>
           <w:b/>
           <w:color w:val="000000"/>
           <w:lang w:val="es-ES" w:eastAsia="en-US"/>
         </w:rPr>
-        <w:t>Restaurante:</w:t>
-      </w:r>
-      <w:r>
-        <w:rPr>
+      </w:pPr>
+      <w:r>
+        <w:rPr>
+          <w:b/>
           <w:color w:val="000000"/>
           <w:lang w:val="es-ES" w:eastAsia="en-US"/>
         </w:rPr>
-        <w:t xml:space="preserve"> Proveedor autorizado para registrar consumos en el sistema</w:t>
+        <w:t>Sistema MesaPass: Plataforma SaaS multi-tenant</w:t>
       </w:r>
     </w:p>
     <w:p>
@@ -5078,71 +5060,18 @@
           <w:numId w:val="5"/>
         </w:numPr>
         <w:rPr>
-          <w:color w:val="000000"/>
-          <w:lang w:val="es-ES" w:eastAsia="en-US"/>
-        </w:rPr>
-      </w:pPr>
-      <w:r>
-        <w:rPr>
           <w:b/>
           <w:color w:val="000000"/>
           <w:lang w:val="es-ES" w:eastAsia="en-US"/>
         </w:rPr>
-        <w:t xml:space="preserve">Sistema </w:t>
-      </w:r>
-      <w:proofErr w:type="spellStart"/>
+      </w:pPr>
       <w:r>
         <w:rPr>
           <w:b/>
           <w:color w:val="000000"/>
           <w:lang w:val="es-ES" w:eastAsia="en-US"/>
         </w:rPr>
-        <w:t>MesaPass</w:t>
-      </w:r>
-      <w:proofErr w:type="spellEnd"/>
-      <w:r>
-        <w:rPr>
-          <w:b/>
-          <w:color w:val="000000"/>
-          <w:lang w:val="es-ES" w:eastAsia="en-US"/>
-        </w:rPr>
-        <w:t>:</w:t>
-      </w:r>
-      <w:r>
-        <w:rPr>
-          <w:color w:val="000000"/>
-          <w:lang w:val="es-ES" w:eastAsia="en-US"/>
-        </w:rPr>
-        <w:t xml:space="preserve"> Plataforma que gestiona usuarios, consumos y convenios</w:t>
-      </w:r>
-    </w:p>
-    <w:p>
-      <w:pPr>
-        <w:pStyle w:val="Textoindependiente"/>
-        <w:numPr>
-          <w:ilvl w:val="0"/>
-          <w:numId w:val="5"/>
-        </w:numPr>
-        <w:rPr>
-          <w:b/>
-          <w:color w:val="000000"/>
-          <w:lang w:val="es-ES" w:eastAsia="en-US"/>
-        </w:rPr>
-      </w:pPr>
-      <w:r>
-        <w:rPr>
-          <w:b/>
-          <w:color w:val="000000"/>
-          <w:lang w:val="es-ES" w:eastAsia="en-US"/>
-        </w:rPr>
-        <w:t xml:space="preserve">UC##: </w:t>
-      </w:r>
-      <w:r>
-        <w:rPr>
-          <w:color w:val="000000"/>
-          <w:lang w:val="es-ES" w:eastAsia="en-US"/>
-        </w:rPr>
-        <w:t>Casos de uso</w:t>
+        <w:t>UC##: Casos de uso</w:t>
       </w:r>
     </w:p>
     <w:p>
@@ -5177,23 +5106,7 @@
           <w:rStyle w:val="Textoennegrita"/>
           <w:b w:val="0"/>
         </w:rPr>
-        <w:t xml:space="preserve">En este caso de uso intervienen directamente el empleado, el restaurante y el sistema </w:t>
-      </w:r>
-      <w:proofErr w:type="spellStart"/>
-      <w:r>
-        <w:rPr>
-          <w:rStyle w:val="Textoennegrita"/>
-          <w:b w:val="0"/>
-        </w:rPr>
-        <w:t>MesaPass</w:t>
-      </w:r>
-      <w:proofErr w:type="spellEnd"/>
-      <w:r>
-        <w:rPr>
-          <w:rStyle w:val="Textoennegrita"/>
-          <w:b w:val="0"/>
-        </w:rPr>
-        <w:t>, quienes ejecutan el proceso de registro de consumo mediante la validación de un código QR. Adicionalmente, participan de forma indirecta actores como el administrador, el administrador de la empresa y el usuario, quienes previamente configuran la información necesaria, como el registro de empleados, restaurantes, convenios y cuentas dentro del sistema.</w:t>
+        <w:t>En este caso de uso interviene principalmente el administrador del sistema o usuario autorizado, quien es responsable de configurar los acuerdos entre empresas y restaurantes.</w:t>
       </w:r>
     </w:p>
     <w:p>
@@ -5214,20 +5127,15 @@
         <w:spacing w:line="276" w:lineRule="auto"/>
         <w:rPr>
           <w:rStyle w:val="Textoennegrita"/>
-        </w:rPr>
-      </w:pPr>
-      <w:r>
-        <w:rPr>
-          <w:rStyle w:val="Textoennegrita"/>
-        </w:rPr>
-        <w:t xml:space="preserve">Empleado: </w:t>
-      </w:r>
+          <w:b w:val="0"/>
+        </w:rPr>
+      </w:pPr>
       <w:r>
         <w:rPr>
           <w:rStyle w:val="Textoennegrita"/>
           <w:b w:val="0"/>
         </w:rPr>
-        <w:t>Presenta el código QR para el consumo</w:t>
+        <w:t>Admin: Crea y gestiona acuerdos</w:t>
       </w:r>
     </w:p>
     <w:p>
@@ -5239,21 +5147,26 @@
         <w:spacing w:line="276" w:lineRule="auto"/>
         <w:rPr>
           <w:rStyle w:val="Textoennegrita"/>
-        </w:rPr>
-      </w:pPr>
-      <w:r>
-        <w:rPr>
-          <w:rStyle w:val="Textoennegrita"/>
-        </w:rPr>
-        <w:t xml:space="preserve">Restaurante: </w:t>
-      </w:r>
+          <w:b w:val="0"/>
+        </w:rPr>
+      </w:pPr>
       <w:r>
         <w:rPr>
           <w:rStyle w:val="Textoennegrita"/>
           <w:b w:val="0"/>
         </w:rPr>
-        <w:t>Escanea el QR y confirma el consumo</w:t>
-      </w:r>
+        <w:t>Sistema MesaPass: Valida y registra el acuerdo</w:t>
+      </w:r>
+    </w:p>
+    <w:p>
+      <w:pPr>
+        <w:spacing w:line="276" w:lineRule="auto"/>
+        <w:ind w:left="720"/>
+        <w:rPr>
+          <w:rStyle w:val="Textoennegrita"/>
+          <w:b w:val="0"/>
+        </w:rPr>
+      </w:pPr>
     </w:p>
     <w:p>
       <w:pPr>
@@ -5264,35 +5177,26 @@
         <w:spacing w:line="276" w:lineRule="auto"/>
         <w:rPr>
           <w:rStyle w:val="Textoennegrita"/>
-        </w:rPr>
-      </w:pPr>
-      <w:r>
-        <w:rPr>
-          <w:rStyle w:val="Textoennegrita"/>
-        </w:rPr>
-        <w:t xml:space="preserve">Sistema </w:t>
-      </w:r>
-      <w:proofErr w:type="spellStart"/>
-      <w:r>
-        <w:rPr>
-          <w:rStyle w:val="Textoennegrita"/>
-        </w:rPr>
-        <w:t>MesaPass</w:t>
-      </w:r>
-      <w:proofErr w:type="spellEnd"/>
-      <w:r>
-        <w:rPr>
-          <w:rStyle w:val="Textoennegrita"/>
-        </w:rPr>
-        <w:t xml:space="preserve">: </w:t>
-      </w:r>
+          <w:b w:val="0"/>
+        </w:rPr>
+      </w:pPr>
       <w:r>
         <w:rPr>
           <w:rStyle w:val="Textoennegrita"/>
           <w:b w:val="0"/>
         </w:rPr>
-        <w:t>Valida la información y registra el consumo</w:t>
-      </w:r>
+        <w:t>Actores indirectos:</w:t>
+      </w:r>
+    </w:p>
+    <w:p>
+      <w:pPr>
+        <w:spacing w:line="276" w:lineRule="auto"/>
+        <w:ind w:left="720"/>
+        <w:rPr>
+          <w:rStyle w:val="Textoennegrita"/>
+          <w:b w:val="0"/>
+        </w:rPr>
+      </w:pPr>
     </w:p>
     <w:p>
       <w:pPr>
@@ -5303,28 +5207,15 @@
         <w:spacing w:line="276" w:lineRule="auto"/>
         <w:rPr>
           <w:rStyle w:val="Textoennegrita"/>
-        </w:rPr>
-      </w:pPr>
-      <w:proofErr w:type="spellStart"/>
-      <w:r>
-        <w:rPr>
-          <w:rStyle w:val="Textoennegrita"/>
-        </w:rPr>
-        <w:t>Admin</w:t>
-      </w:r>
-      <w:proofErr w:type="spellEnd"/>
-      <w:r>
-        <w:rPr>
-          <w:rStyle w:val="Textoennegrita"/>
-        </w:rPr>
-        <w:t xml:space="preserve">: </w:t>
-      </w:r>
+          <w:b w:val="0"/>
+        </w:rPr>
+      </w:pPr>
       <w:r>
         <w:rPr>
           <w:rStyle w:val="Textoennegrita"/>
           <w:b w:val="0"/>
         </w:rPr>
-        <w:t>Participa de forma indirecta (configura restaurantes y convenios previamente)</w:t>
+        <w:t>Company Admin: Se beneficia del acuerdo configurado</w:t>
       </w:r>
     </w:p>
     <w:p>
@@ -5336,34 +5227,15 @@
         <w:spacing w:line="276" w:lineRule="auto"/>
         <w:rPr>
           <w:rStyle w:val="Textoennegrita"/>
-        </w:rPr>
-      </w:pPr>
-      <w:r>
-        <w:rPr>
-          <w:rStyle w:val="Textoennegrita"/>
-        </w:rPr>
-        <w:t xml:space="preserve">Company </w:t>
-      </w:r>
-      <w:proofErr w:type="spellStart"/>
-      <w:r>
-        <w:rPr>
-          <w:rStyle w:val="Textoennegrita"/>
-        </w:rPr>
-        <w:t>Admin</w:t>
-      </w:r>
-      <w:proofErr w:type="spellEnd"/>
-      <w:r>
-        <w:rPr>
-          <w:rStyle w:val="Textoennegrita"/>
-        </w:rPr>
-        <w:t xml:space="preserve">: </w:t>
-      </w:r>
+          <w:b w:val="0"/>
+        </w:rPr>
+      </w:pPr>
       <w:r>
         <w:rPr>
           <w:rStyle w:val="Textoennegrita"/>
           <w:b w:val="0"/>
         </w:rPr>
-        <w:t>Participa de forma indirecta (registra empleados y genera códigos QR)</w:t>
+        <w:t>Restaurante: Participa como proveedor en el acuerdo</w:t>
       </w:r>
     </w:p>
     <w:p>
@@ -5381,15 +5253,16 @@
       <w:r>
         <w:rPr>
           <w:rStyle w:val="Textoennegrita"/>
-        </w:rPr>
-        <w:t xml:space="preserve">Usuario: </w:t>
+          <w:b w:val="0"/>
+        </w:rPr>
+        <w:t>Empleado: Utiliza el acuerdo para realizar consumos</w:t>
       </w:r>
       <w:r>
         <w:rPr>
           <w:rStyle w:val="Textoennegrita"/>
           <w:b w:val="0"/>
         </w:rPr>
-        <w:t>Participa de forma indirecta (registro inicial en el sistema)</w:t>
+        <w:t>a)</w:t>
       </w:r>
     </w:p>
     <w:p>
@@ -5408,32 +5281,60 @@
       <w:bookmarkEnd w:id="12"/>
     </w:p>
     <w:p>
+      <w:bookmarkStart w:id="13" w:name="_Toc296587030"/>
+      <w:r>
+        <w:t>Para que un acuerdo pueda ser creado correctamente, deben existir previamente las entidades involucradas dentro del sistema.</w:t>
+      </w:r>
+    </w:p>
+    <w:p>
       <w:pPr>
         <w:ind w:left="425"/>
       </w:pPr>
-      <w:bookmarkStart w:id="13" w:name="_Toc296587030"/>
-      <w:r>
-        <w:t>• El empleado debe estar registrado en el sistema</w:t>
-      </w:r>
-      <w:r>
-        <w:br/>
-        <w:t>• El empleado debe contar con un código QR válido</w:t>
-      </w:r>
-      <w:r>
-        <w:br/>
-        <w:t>• El restaurante debe estar registrado en el sistema</w:t>
-      </w:r>
-      <w:r>
-        <w:br/>
-        <w:t>• Debe existir un convenio activo entre la empresa y el restaurante</w:t>
-      </w:r>
-      <w:r>
-        <w:br/>
-        <w:t>• El sistema debe estar operativo y accesible</w:t>
-      </w:r>
-      <w:r>
-        <w:br/>
-        <w:t>• El usuario del restaurante debe estar autenticado en la plataforma</w:t>
+    </w:p>
+    <w:p>
+      <w:pPr>
+        <w:ind w:left="425"/>
+      </w:pPr>
+    </w:p>
+    <w:p>
+      <w:pPr>
+        <w:ind w:left="425"/>
+      </w:pPr>
+      <w:r>
+        <w:lastRenderedPageBreak/>
+        <w:t>• La empresa debe estar registrada</w:t>
+      </w:r>
+    </w:p>
+    <w:p>
+      <w:pPr>
+        <w:ind w:left="425"/>
+      </w:pPr>
+      <w:r>
+        <w:t>• El restaurante debe estar registrado</w:t>
+      </w:r>
+    </w:p>
+    <w:p>
+      <w:pPr>
+        <w:ind w:left="425"/>
+      </w:pPr>
+      <w:r>
+        <w:t>• El usuario (Admin) debe estar autenticado</w:t>
+      </w:r>
+    </w:p>
+    <w:p>
+      <w:pPr>
+        <w:ind w:left="425"/>
+      </w:pPr>
+      <w:r>
+        <w:t>• Debe existir un tenant válido</w:t>
+      </w:r>
+    </w:p>
+    <w:p>
+      <w:pPr>
+        <w:ind w:left="425"/>
+      </w:pPr>
+      <w:r>
+        <w:t>• El sistema debe estar disponible</w:t>
       </w:r>
     </w:p>
     <w:p>
@@ -5446,7 +5347,6 @@
       </w:pPr>
       <w:bookmarkStart w:id="14" w:name="_Toc227178516"/>
       <w:r>
-        <w:lastRenderedPageBreak/>
         <w:t>Flujo de Eventos</w:t>
       </w:r>
       <w:bookmarkEnd w:id="8"/>
@@ -5482,123 +5382,20 @@
       <w:bookmarkEnd w:id="17"/>
     </w:p>
     <w:p>
+      <w:pPr>
+        <w:spacing w:line="276" w:lineRule="auto"/>
+      </w:pPr>
       <w:bookmarkStart w:id="18" w:name="_Toc296587032"/>
       <w:bookmarkStart w:id="19" w:name="_Toc535910788"/>
       <w:r>
-        <w:t>5.1 Flujo Básico</w:t>
-      </w:r>
-    </w:p>
-    <w:p>
-      <w:pPr>
-        <w:numPr>
-          <w:ilvl w:val="0"/>
-          <w:numId w:val="8"/>
-        </w:numPr>
-      </w:pPr>
-      <w:r>
-        <w:t>El caso de uso inicia cuando el Empleado presenta su código QR en el restaurante.</w:t>
-      </w:r>
-    </w:p>
-    <w:p>
-      <w:pPr>
-        <w:numPr>
-          <w:ilvl w:val="0"/>
-          <w:numId w:val="8"/>
-        </w:numPr>
-      </w:pPr>
-      <w:r>
-        <w:t xml:space="preserve">El Restaurante escanea el código QR utilizando la aplicación del sistema </w:t>
-      </w:r>
-      <w:proofErr w:type="spellStart"/>
-      <w:r>
-        <w:t>MesaPass</w:t>
-      </w:r>
-      <w:proofErr w:type="spellEnd"/>
-      <w:r>
-        <w:t>.</w:t>
-      </w:r>
-    </w:p>
-    <w:p>
-      <w:pPr>
-        <w:numPr>
-          <w:ilvl w:val="0"/>
-          <w:numId w:val="8"/>
-        </w:numPr>
-      </w:pPr>
-      <w:r>
-        <w:t xml:space="preserve">El Sistema </w:t>
-      </w:r>
-      <w:proofErr w:type="spellStart"/>
-      <w:r>
-        <w:t>MesaPass</w:t>
-      </w:r>
-      <w:proofErr w:type="spellEnd"/>
-      <w:r>
-        <w:t> recibe el código QR y valida su autenticidad (verifica que corresponda a un empleado registrado).</w:t>
-      </w:r>
-    </w:p>
-    <w:p>
-      <w:pPr>
-        <w:numPr>
-          <w:ilvl w:val="0"/>
-          <w:numId w:val="8"/>
-        </w:numPr>
-      </w:pPr>
-      <w:r>
-        <w:t>El Sistema obtiene los datos del empleado asociados al código QR.</w:t>
-      </w:r>
-    </w:p>
-    <w:p>
-      <w:pPr>
-        <w:numPr>
-          <w:ilvl w:val="0"/>
-          <w:numId w:val="8"/>
-        </w:numPr>
-      </w:pPr>
-      <w:r>
-        <w:t>El Restaurante confirma el consumo ingresando detalles de la comida (tipo de comida y valor).</w:t>
-      </w:r>
-    </w:p>
-    <w:p>
-      <w:pPr>
-        <w:numPr>
-          <w:ilvl w:val="0"/>
-          <w:numId w:val="8"/>
-        </w:numPr>
-      </w:pPr>
-      <w:r>
-        <w:t>El Sistema verifica que exista un convenio activo entre la empresa del empleado y el restaurante.</w:t>
-      </w:r>
-    </w:p>
-    <w:p>
-      <w:pPr>
-        <w:numPr>
-          <w:ilvl w:val="0"/>
-          <w:numId w:val="8"/>
-        </w:numPr>
-      </w:pPr>
-      <w:r>
-        <w:t xml:space="preserve">El Sistema calcula el monto a cobrar según el tipo de convenio (prepago, </w:t>
-      </w:r>
-      <w:proofErr w:type="spellStart"/>
-      <w:r>
-        <w:t>postpago</w:t>
-      </w:r>
-      <w:proofErr w:type="spellEnd"/>
-      <w:r>
-        <w:t xml:space="preserve"> o mixto).</w:t>
-      </w:r>
-    </w:p>
-    <w:p>
-      <w:pPr>
-        <w:numPr>
-          <w:ilvl w:val="0"/>
-          <w:numId w:val="8"/>
-        </w:numPr>
-      </w:pPr>
-      <w:r>
-        <w:t>El Sistema registra el consumo con los datos proporcionados.</w:t>
-      </w:r>
+        <w:t>El flujo básico describe el proceso estándar mediante el cual se crea un acuerdo sin errores.</w:t>
+      </w:r>
+    </w:p>
+    <w:p>
+      <w:pPr>
+        <w:spacing w:line="276" w:lineRule="auto"/>
+        <w:ind w:left="720"/>
+      </w:pPr>
     </w:p>
     <w:p>
       <w:pPr>
@@ -5609,7 +5406,7 @@
         <w:spacing w:line="276" w:lineRule="auto"/>
       </w:pPr>
       <w:r>
-        <w:t>El Sistema guarda el registro del consumo en la base de datos.</w:t>
+        <w:t>El Admin accede al módulo de acuerdos</w:t>
       </w:r>
     </w:p>
     <w:p>
@@ -5621,7 +5418,82 @@
         <w:spacing w:line="276" w:lineRule="auto"/>
       </w:pPr>
       <w:r>
-        <w:t>El Sistema informa al Restaurante que el consumo ha sido registrado correctamente.</w:t>
+        <w:t>El Admin selecciona la opción “Crear acuerdo”</w:t>
+      </w:r>
+    </w:p>
+    <w:p>
+      <w:pPr>
+        <w:numPr>
+          <w:ilvl w:val="0"/>
+          <w:numId w:val="8"/>
+        </w:numPr>
+        <w:spacing w:line="276" w:lineRule="auto"/>
+      </w:pPr>
+      <w:r>
+        <w:t>El Admin selecciona la empresa y el restaurante</w:t>
+      </w:r>
+    </w:p>
+    <w:p>
+      <w:pPr>
+        <w:numPr>
+          <w:ilvl w:val="0"/>
+          <w:numId w:val="8"/>
+        </w:numPr>
+        <w:spacing w:line="276" w:lineRule="auto"/>
+      </w:pPr>
+      <w:r>
+        <w:t>El Admin define las condiciones del acuerdo (tipo, fechas, reglas)</w:t>
+      </w:r>
+    </w:p>
+    <w:p>
+      <w:pPr>
+        <w:numPr>
+          <w:ilvl w:val="0"/>
+          <w:numId w:val="8"/>
+        </w:numPr>
+        <w:spacing w:line="276" w:lineRule="auto"/>
+      </w:pPr>
+      <w:r>
+        <w:t>El Sistema valida la información ingresada</w:t>
+      </w:r>
+    </w:p>
+    <w:p>
+      <w:pPr>
+        <w:numPr>
+          <w:ilvl w:val="0"/>
+          <w:numId w:val="8"/>
+        </w:numPr>
+        <w:spacing w:line="276" w:lineRule="auto"/>
+      </w:pPr>
+      <w:r>
+        <w:t>El Sistema verifica que no exista un acuerdo duplicado</w:t>
+      </w:r>
+    </w:p>
+    <w:p>
+      <w:pPr>
+        <w:numPr>
+          <w:ilvl w:val="0"/>
+          <w:numId w:val="8"/>
+        </w:numPr>
+        <w:spacing w:line="276" w:lineRule="auto"/>
+      </w:pPr>
+      <w:r>
+        <w:t>El Sistema registra el acuerdo en la base de datos</w:t>
+      </w:r>
+    </w:p>
+    <w:p>
+      <w:pPr>
+        <w:numPr>
+          <w:ilvl w:val="0"/>
+          <w:numId w:val="8"/>
+        </w:numPr>
+        <w:spacing w:line="276" w:lineRule="auto"/>
+      </w:pPr>
+      <w:r>
+        <w:t>El Sistema confirma la creación del acuerdo</w:t>
+      </w:r>
+      <w:r>
+        <w:t>.</w:t>
       </w:r>
     </w:p>
     <w:p>
@@ -5678,15 +5550,40 @@
         <w:t xml:space="preserve">SF01. </w:t>
       </w:r>
       <w:bookmarkEnd w:id="21"/>
+      <w:bookmarkEnd w:id="22"/>
       <w:r>
         <w:rPr>
           <w:sz w:val="20"/>
           <w:szCs w:val="20"/>
           <w:lang w:val="es-ES"/>
         </w:rPr>
-        <w:t>Registro de Consumo</w:t>
-      </w:r>
-      <w:bookmarkEnd w:id="22"/>
+        <w:t>Validación de Datos</w:t>
+      </w:r>
+    </w:p>
+    <w:p>
+      <w:pPr>
+        <w:rPr>
+          <w:rFonts w:cs="Arial"/>
+          <w:lang w:eastAsia="es-EC"/>
+        </w:rPr>
+      </w:pPr>
+      <w:bookmarkStart w:id="23" w:name="_Toc296587034"/>
+      <w:r>
+        <w:rPr>
+          <w:rFonts w:cs="Arial"/>
+          <w:lang w:eastAsia="es-EC"/>
+        </w:rPr>
+        <w:t>Este subflujo se encarga de validar que la información ingresada cumpla con los requisitos definidos por el sistema.</w:t>
+      </w:r>
+    </w:p>
+    <w:p>
+      <w:pPr>
+        <w:ind w:left="785"/>
+        <w:rPr>
+          <w:rFonts w:cs="Arial"/>
+          <w:lang w:eastAsia="es-EC"/>
+        </w:rPr>
+      </w:pPr>
     </w:p>
     <w:p>
       <w:pPr>
@@ -5694,20 +5591,17 @@
           <w:ilvl w:val="0"/>
           <w:numId w:val="10"/>
         </w:numPr>
-        <w:suppressAutoHyphens w:val="0"/>
-        <w:jc w:val="left"/>
         <w:rPr>
           <w:rFonts w:cs="Arial"/>
           <w:lang w:eastAsia="es-EC"/>
         </w:rPr>
       </w:pPr>
-      <w:bookmarkStart w:id="23" w:name="_Toc296587034"/>
       <w:r>
         <w:rPr>
           <w:rFonts w:cs="Arial"/>
           <w:lang w:eastAsia="es-EC"/>
         </w:rPr>
-        <w:t xml:space="preserve">El Sistema valida que exista un convenio activo entre la empresa y el restaurante. </w:t>
+        <w:t>Validación de campos obligatorios</w:t>
       </w:r>
     </w:p>
     <w:p>
@@ -5716,8 +5610,6 @@
           <w:ilvl w:val="0"/>
           <w:numId w:val="10"/>
         </w:numPr>
-        <w:suppressAutoHyphens w:val="0"/>
-        <w:jc w:val="left"/>
         <w:rPr>
           <w:rFonts w:cs="Arial"/>
           <w:lang w:eastAsia="es-EC"/>
@@ -5728,23 +5620,7 @@
           <w:rFonts w:cs="Arial"/>
           <w:lang w:eastAsia="es-EC"/>
         </w:rPr>
-        <w:t xml:space="preserve">El Sistema verifica las condiciones del convenio (prepago, </w:t>
-      </w:r>
-      <w:proofErr w:type="spellStart"/>
-      <w:r>
-        <w:rPr>
-          <w:rFonts w:cs="Arial"/>
-          <w:lang w:eastAsia="es-EC"/>
-        </w:rPr>
-        <w:t>postpago</w:t>
-      </w:r>
-      <w:proofErr w:type="spellEnd"/>
-      <w:r>
-        <w:rPr>
-          <w:rFonts w:cs="Arial"/>
-          <w:lang w:eastAsia="es-EC"/>
-        </w:rPr>
-        <w:t xml:space="preserve"> o mixto). </w:t>
+        <w:t>Validación de fechas (inicio &lt; fin)</w:t>
       </w:r>
     </w:p>
     <w:p>
@@ -5753,8 +5629,6 @@
           <w:ilvl w:val="0"/>
           <w:numId w:val="10"/>
         </w:numPr>
-        <w:suppressAutoHyphens w:val="0"/>
-        <w:jc w:val="left"/>
         <w:rPr>
           <w:rFonts w:cs="Arial"/>
           <w:lang w:eastAsia="es-EC"/>
@@ -5765,7 +5639,7 @@
           <w:rFonts w:cs="Arial"/>
           <w:lang w:eastAsia="es-EC"/>
         </w:rPr>
-        <w:t xml:space="preserve">El Sistema calcula el monto correspondiente al consumo. </w:t>
+        <w:t>Validación de tipo de convenio</w:t>
       </w:r>
     </w:p>
     <w:p>
@@ -5774,20 +5648,75 @@
           <w:ilvl w:val="0"/>
           <w:numId w:val="10"/>
         </w:numPr>
-        <w:suppressAutoHyphens w:val="0"/>
-        <w:jc w:val="left"/>
+        <w:rPr>
+          <w:rFonts w:cs="Arial"/>
+        </w:rPr>
+      </w:pPr>
+      <w:r>
         <w:rPr>
           <w:rFonts w:cs="Arial"/>
           <w:lang w:eastAsia="es-EC"/>
         </w:rPr>
-      </w:pPr>
+        <w:t>Retorno al flujo principal</w:t>
+      </w:r>
       <w:r>
         <w:rPr>
           <w:rFonts w:cs="Arial"/>
           <w:lang w:eastAsia="es-EC"/>
         </w:rPr>
-        <w:t xml:space="preserve">El Sistema registra el consumo con los datos del empleado y del restaurante. </w:t>
-      </w:r>
+        <w:t>.</w:t>
+      </w:r>
+    </w:p>
+    <w:p>
+      <w:pPr>
+        <w:pStyle w:val="Ttulo3"/>
+        <w:spacing w:line="276" w:lineRule="auto"/>
+        <w:rPr>
+          <w:sz w:val="20"/>
+          <w:szCs w:val="20"/>
+          <w:lang w:val="es-ES"/>
+        </w:rPr>
+      </w:pPr>
+      <w:r>
+        <w:rPr>
+          <w:sz w:val="20"/>
+          <w:szCs w:val="20"/>
+          <w:lang w:val="es-ES"/>
+        </w:rPr>
+        <w:t xml:space="preserve">SF01. </w:t>
+      </w:r>
+      <w:r>
+        <w:rPr>
+          <w:sz w:val="20"/>
+          <w:szCs w:val="20"/>
+          <w:lang w:val="es-ES"/>
+        </w:rPr>
+        <w:t>Verificación de Existencia</w:t>
+      </w:r>
+    </w:p>
+    <w:p>
+      <w:pPr>
+        <w:rPr>
+          <w:rFonts w:cs="Arial"/>
+          <w:lang w:eastAsia="es-EC"/>
+        </w:rPr>
+      </w:pPr>
+      <w:r>
+        <w:rPr>
+          <w:rFonts w:cs="Arial"/>
+          <w:lang w:eastAsia="es-EC"/>
+        </w:rPr>
+        <w:t>Este subflujo verifica que no exista ya un acuerdo activo entre la empresa y el restaurante.</w:t>
+      </w:r>
+    </w:p>
+    <w:p>
+      <w:pPr>
+        <w:ind w:left="785"/>
+        <w:rPr>
+          <w:rFonts w:cs="Arial"/>
+          <w:lang w:eastAsia="es-EC"/>
+        </w:rPr>
+      </w:pPr>
     </w:p>
     <w:p>
       <w:pPr>
@@ -5795,8 +5724,6 @@
           <w:ilvl w:val="0"/>
           <w:numId w:val="10"/>
         </w:numPr>
-        <w:suppressAutoHyphens w:val="0"/>
-        <w:jc w:val="left"/>
         <w:rPr>
           <w:rFonts w:cs="Arial"/>
           <w:lang w:eastAsia="es-EC"/>
@@ -5807,7 +5734,7 @@
           <w:rFonts w:cs="Arial"/>
           <w:lang w:eastAsia="es-EC"/>
         </w:rPr>
-        <w:t xml:space="preserve">El Sistema almacena el registro en la base de datos. </w:t>
+        <w:t>Búsqueda de acuerdos existentes</w:t>
       </w:r>
     </w:p>
     <w:p>
@@ -5818,6 +5745,7 @@
         </w:numPr>
         <w:rPr>
           <w:rFonts w:cs="Arial"/>
+          <w:lang w:eastAsia="es-EC"/>
         </w:rPr>
       </w:pPr>
       <w:r>
@@ -5825,8 +5753,59 @@
           <w:rFonts w:cs="Arial"/>
           <w:lang w:eastAsia="es-EC"/>
         </w:rPr>
-        <w:t>El flujo retorna al proceso principal.</w:t>
-      </w:r>
+        <w:t>Validación de duplicidad</w:t>
+      </w:r>
+    </w:p>
+    <w:p>
+      <w:pPr>
+        <w:numPr>
+          <w:ilvl w:val="0"/>
+          <w:numId w:val="10"/>
+        </w:numPr>
+        <w:rPr>
+          <w:rFonts w:cs="Arial"/>
+          <w:lang w:eastAsia="es-EC"/>
+        </w:rPr>
+      </w:pPr>
+      <w:r>
+        <w:rPr>
+          <w:rFonts w:cs="Arial"/>
+          <w:lang w:eastAsia="es-EC"/>
+        </w:rPr>
+        <w:t>Confirmación de disponibilidad</w:t>
+      </w:r>
+    </w:p>
+    <w:p>
+      <w:pPr>
+        <w:numPr>
+          <w:ilvl w:val="0"/>
+          <w:numId w:val="10"/>
+        </w:numPr>
+        <w:rPr>
+          <w:rFonts w:cs="Arial"/>
+        </w:rPr>
+      </w:pPr>
+      <w:r>
+        <w:rPr>
+          <w:rFonts w:cs="Arial"/>
+          <w:lang w:eastAsia="es-EC"/>
+        </w:rPr>
+        <w:t>Retorno al flujo principal</w:t>
+      </w:r>
+      <w:r>
+        <w:rPr>
+          <w:rFonts w:cs="Arial"/>
+          <w:lang w:eastAsia="es-EC"/>
+        </w:rPr>
+        <w:t>.</w:t>
+      </w:r>
+    </w:p>
+    <w:p>
+      <w:pPr>
+        <w:rPr>
+          <w:rFonts w:cs="Arial"/>
+        </w:rPr>
+      </w:pPr>
     </w:p>
     <w:p>
       <w:pPr>
@@ -5889,7 +5868,23 @@
           <w:szCs w:val="20"/>
           <w:lang w:val="es-ES"/>
         </w:rPr>
-        <w:t>FA01. &lt; Primer Flujo Alterno &gt;</w:t>
+        <w:t xml:space="preserve">FA01. &lt; </w:t>
+      </w:r>
+      <w:r>
+        <w:rPr>
+          <w:sz w:val="20"/>
+          <w:szCs w:val="20"/>
+          <w:lang w:val="es-ES"/>
+        </w:rPr>
+        <w:t>Empresa o restaurante inexistente</w:t>
+      </w:r>
+      <w:r>
+        <w:rPr>
+          <w:sz w:val="20"/>
+          <w:szCs w:val="20"/>
+          <w:lang w:val="es-ES"/>
+        </w:rPr>
+        <w:t>&gt;</w:t>
       </w:r>
       <w:bookmarkEnd w:id="25"/>
       <w:bookmarkEnd w:id="26"/>
@@ -5899,6 +5894,16 @@
       <w:bookmarkEnd w:id="30"/>
     </w:p>
     <w:p>
+      <w:r>
+        <w:t>Este flujo ocurre cuando alguna de las entidades no está registrada en el sistema.</w:t>
+      </w:r>
+    </w:p>
+    <w:p>
+      <w:pPr>
+        <w:ind w:left="720"/>
+      </w:pPr>
+    </w:p>
+    <w:p>
       <w:pPr>
         <w:numPr>
           <w:ilvl w:val="0"/>
@@ -5906,7 +5911,8 @@
         </w:numPr>
       </w:pPr>
       <w:r>
-        <w:t>El Sistema detecta que el código QR no es válido o no existe.</w:t>
+        <w:lastRenderedPageBreak/>
+        <w:t>El Sistema detecta inexistencia</w:t>
       </w:r>
     </w:p>
     <w:p>
@@ -5917,7 +5923,7 @@
         </w:numPr>
       </w:pPr>
       <w:r>
-        <w:t>El Sistema muestra un mensaje de error al restaurante.</w:t>
+        <w:t>El Sistema muestra mensaje de error</w:t>
       </w:r>
     </w:p>
     <w:p>
@@ -5928,7 +5934,10 @@
         </w:numPr>
       </w:pPr>
       <w:r>
-        <w:t>El proceso finaliza sin registrar el consumo.</w:t>
+        <w:t>El proceso finaliza</w:t>
+      </w:r>
+      <w:r>
+        <w:t>.</w:t>
       </w:r>
     </w:p>
     <w:p>
@@ -5958,7 +5967,23 @@
           <w:szCs w:val="20"/>
           <w:lang w:val="es-ES"/>
         </w:rPr>
-        <w:t>FA02. &lt; Segundo Flujo Alterno &gt;</w:t>
+        <w:t xml:space="preserve">FA02. &lt; </w:t>
+      </w:r>
+      <w:r>
+        <w:rPr>
+          <w:sz w:val="20"/>
+          <w:szCs w:val="20"/>
+          <w:lang w:val="es-ES"/>
+        </w:rPr>
+        <w:t>Acuerdo duplicado</w:t>
+      </w:r>
+      <w:r>
+        <w:rPr>
+          <w:sz w:val="20"/>
+          <w:szCs w:val="20"/>
+          <w:lang w:val="es-ES"/>
+        </w:rPr>
+        <w:t>&gt;</w:t>
       </w:r>
       <w:bookmarkEnd w:id="31"/>
       <w:bookmarkEnd w:id="32"/>
@@ -5969,25 +5994,47 @@
     </w:p>
     <w:p>
       <w:pPr>
+        <w:rPr>
+          <w:rFonts w:cs="Arial"/>
+          <w:lang w:eastAsia="es-EC"/>
+        </w:rPr>
+      </w:pPr>
+      <w:bookmarkStart w:id="37" w:name="_Toc296587037"/>
+      <w:bookmarkStart w:id="38" w:name="_Toc535910791"/>
+      <w:r>
+        <w:rPr>
+          <w:rFonts w:cs="Arial"/>
+          <w:lang w:eastAsia="es-EC"/>
+        </w:rPr>
+        <w:t>Este flujo se activa cuando ya existe un acuerdo vigente entre la empresa y el restaurante.</w:t>
+      </w:r>
+    </w:p>
+    <w:p>
+      <w:pPr>
+        <w:ind w:left="720"/>
+        <w:rPr>
+          <w:rFonts w:cs="Arial"/>
+          <w:lang w:eastAsia="es-EC"/>
+        </w:rPr>
+      </w:pPr>
+    </w:p>
+    <w:p>
+      <w:pPr>
         <w:numPr>
           <w:ilvl w:val="0"/>
           <w:numId w:val="12"/>
         </w:numPr>
-        <w:suppressAutoHyphens w:val="0"/>
-        <w:jc w:val="left"/>
         <w:rPr>
           <w:rFonts w:cs="Arial"/>
           <w:lang w:eastAsia="es-EC"/>
         </w:rPr>
       </w:pPr>
-      <w:bookmarkStart w:id="37" w:name="_Toc296587037"/>
-      <w:bookmarkStart w:id="38" w:name="_Toc535910791"/>
       <w:r>
         <w:rPr>
           <w:rFonts w:cs="Arial"/>
           <w:lang w:eastAsia="es-EC"/>
         </w:rPr>
-        <w:t xml:space="preserve">El Sistema detecta que no existe un convenio vigente entre la empresa y el restaurante. </w:t>
+        <w:t>El Sistema detecta duplicidad</w:t>
       </w:r>
     </w:p>
     <w:p>
@@ -5996,8 +6043,6 @@
           <w:ilvl w:val="0"/>
           <w:numId w:val="12"/>
         </w:numPr>
-        <w:suppressAutoHyphens w:val="0"/>
-        <w:jc w:val="left"/>
         <w:rPr>
           <w:rFonts w:cs="Arial"/>
           <w:lang w:eastAsia="es-EC"/>
@@ -6008,7 +6053,7 @@
           <w:rFonts w:cs="Arial"/>
           <w:lang w:eastAsia="es-EC"/>
         </w:rPr>
-        <w:t xml:space="preserve">El Sistema muestra una notificación indicando que no se puede realizar el consumo. </w:t>
+        <w:t>El Sistema muestra mensaje de error</w:t>
       </w:r>
     </w:p>
     <w:p>
@@ -6027,16 +6072,15 @@
           <w:rFonts w:cs="Arial"/>
           <w:lang w:eastAsia="es-EC"/>
         </w:rPr>
-        <w:t>El proceso finaliza sin registrar el consumo.</w:t>
-      </w:r>
-    </w:p>
-    <w:p>
-      <w:pPr>
+        <w:t>El proceso finaliza</w:t>
+      </w:r>
+      <w:r>
         <w:rPr>
           <w:rFonts w:cs="Arial"/>
           <w:lang w:eastAsia="es-EC"/>
         </w:rPr>
-      </w:pPr>
+        <w:t>.</w:t>
+      </w:r>
     </w:p>
     <w:p>
       <w:pPr>
@@ -6048,19 +6092,74 @@
     </w:p>
     <w:p>
       <w:pPr>
+        <w:pStyle w:val="Ttulo3"/>
+        <w:tabs>
+          <w:tab w:val="clear" w:pos="709"/>
+        </w:tabs>
+        <w:suppressAutoHyphens w:val="0"/>
+        <w:spacing w:before="200" w:line="240" w:lineRule="atLeast"/>
+        <w:ind w:left="720" w:hanging="720"/>
+        <w:rPr>
+          <w:sz w:val="20"/>
+          <w:szCs w:val="20"/>
+          <w:lang w:val="es-ES"/>
+        </w:rPr>
+      </w:pPr>
+      <w:r>
+        <w:rPr>
+          <w:sz w:val="20"/>
+          <w:szCs w:val="20"/>
+          <w:lang w:val="es-ES"/>
+        </w:rPr>
+        <w:t>FA0</w:t>
+      </w:r>
+      <w:r>
+        <w:rPr>
+          <w:sz w:val="20"/>
+          <w:szCs w:val="20"/>
+          <w:lang w:val="es-ES"/>
+        </w:rPr>
+        <w:t>3</w:t>
+      </w:r>
+      <w:r>
+        <w:rPr>
+          <w:sz w:val="20"/>
+          <w:szCs w:val="20"/>
+          <w:lang w:val="es-ES"/>
+        </w:rPr>
+        <w:t xml:space="preserve">. &lt; </w:t>
+      </w:r>
+      <w:r>
+        <w:rPr>
+          <w:sz w:val="20"/>
+          <w:szCs w:val="20"/>
+          <w:lang w:val="es-ES"/>
+        </w:rPr>
+        <w:t>Datos inválidos</w:t>
+      </w:r>
+      <w:r>
+        <w:rPr>
+          <w:sz w:val="20"/>
+          <w:szCs w:val="20"/>
+          <w:lang w:val="es-ES"/>
+        </w:rPr>
+        <w:t>&gt;</w:t>
+      </w:r>
+    </w:p>
+    <w:p>
+      <w:pPr>
         <w:rPr>
           <w:rFonts w:cs="Arial"/>
           <w:lang w:eastAsia="es-EC"/>
         </w:rPr>
       </w:pPr>
-    </w:p>
-    <w:p>
-      <w:pPr>
+      <w:r>
         <w:rPr>
           <w:rFonts w:cs="Arial"/>
           <w:lang w:eastAsia="es-EC"/>
         </w:rPr>
-      </w:pPr>
+        <w:t>Este flujo ocurre cuando la información ingresada no cumple con las validaciones.</w:t>
+      </w:r>
     </w:p>
     <w:p>
       <w:pPr>
@@ -6072,11 +6171,83 @@
     </w:p>
     <w:p>
       <w:pPr>
+        <w:pStyle w:val="Prrafodelista"/>
+        <w:numPr>
+          <w:ilvl w:val="0"/>
+          <w:numId w:val="18"/>
+        </w:numPr>
         <w:rPr>
           <w:rFonts w:cs="Arial"/>
           <w:lang w:eastAsia="es-EC"/>
         </w:rPr>
       </w:pPr>
+      <w:r>
+        <w:rPr>
+          <w:rFonts w:cs="Arial"/>
+          <w:lang w:eastAsia="es-EC"/>
+        </w:rPr>
+        <w:t>El Sistema detecta errores</w:t>
+      </w:r>
+    </w:p>
+    <w:p>
+      <w:pPr>
+        <w:pStyle w:val="Prrafodelista"/>
+        <w:numPr>
+          <w:ilvl w:val="0"/>
+          <w:numId w:val="18"/>
+        </w:numPr>
+        <w:rPr>
+          <w:rFonts w:cs="Arial"/>
+          <w:lang w:eastAsia="es-EC"/>
+        </w:rPr>
+      </w:pPr>
+      <w:r>
+        <w:rPr>
+          <w:rFonts w:cs="Arial"/>
+          <w:lang w:eastAsia="es-EC"/>
+        </w:rPr>
+        <w:t>El Sistema muestra los errores</w:t>
+      </w:r>
+    </w:p>
+    <w:p>
+      <w:pPr>
+        <w:pStyle w:val="Prrafodelista"/>
+        <w:numPr>
+          <w:ilvl w:val="0"/>
+          <w:numId w:val="18"/>
+        </w:numPr>
+        <w:rPr>
+          <w:rFonts w:cs="Arial"/>
+          <w:lang w:eastAsia="es-EC"/>
+        </w:rPr>
+      </w:pPr>
+      <w:r>
+        <w:rPr>
+          <w:rFonts w:cs="Arial"/>
+          <w:lang w:eastAsia="es-EC"/>
+        </w:rPr>
+        <w:t>El usuario corrige la información</w:t>
+      </w:r>
+    </w:p>
+    <w:p>
+      <w:pPr>
+        <w:pStyle w:val="Prrafodelista"/>
+        <w:numPr>
+          <w:ilvl w:val="0"/>
+          <w:numId w:val="18"/>
+        </w:numPr>
+        <w:rPr>
+          <w:rFonts w:cs="Arial"/>
+          <w:lang w:eastAsia="es-EC"/>
+        </w:rPr>
+      </w:pPr>
+      <w:r>
+        <w:rPr>
+          <w:rFonts w:cs="Arial"/>
+          <w:lang w:eastAsia="es-EC"/>
+        </w:rPr>
+        <w:t>El flujo retorna.</w:t>
+      </w:r>
     </w:p>
     <w:p>
       <w:pPr>
@@ -6096,11 +6267,15 @@
       </w:pPr>
       <w:bookmarkStart w:id="39" w:name="_Toc227178523"/>
       <w:r>
-        <w:lastRenderedPageBreak/>
         <w:t>Reglas del Negocio</w:t>
       </w:r>
       <w:bookmarkEnd w:id="37"/>
       <w:bookmarkEnd w:id="39"/>
+    </w:p>
+    <w:p>
+      <w:r>
+        <w:t>Las reglas del negocio garantizan la correcta gestión de acuerdos dentro del sistema.</w:t>
+      </w:r>
     </w:p>
     <w:p>
       <w:pPr>
@@ -6120,15 +6295,15 @@
         </w:rPr>
         <w:t xml:space="preserve">RN01. </w:t>
       </w:r>
+      <w:bookmarkEnd w:id="40"/>
       <w:r>
         <w:rPr>
           <w:i w:val="0"/>
           <w:sz w:val="24"/>
           <w:szCs w:val="24"/>
         </w:rPr>
-        <w:t>Validación de Código QR</w:t>
-      </w:r>
-      <w:bookmarkEnd w:id="40"/>
+        <w:t>Existencia de Entidades</w:t>
+      </w:r>
     </w:p>
     <w:p>
       <w:pPr>
@@ -6141,7 +6316,13 @@
         <w:rPr>
           <w:sz w:val="24"/>
         </w:rPr>
-        <w:t>El sistema solo permitirá registrar el consumo si el código QR es válido y pertenece a un empleado registrado.</w:t>
+        <w:t>La empresa y el restaurante deben existir previamente</w:t>
+      </w:r>
+      <w:r>
+        <w:rPr>
+          <w:sz w:val="24"/>
+        </w:rPr>
+        <w:t>.</w:t>
       </w:r>
     </w:p>
     <w:p>
@@ -6158,7 +6339,7 @@
           <w:sz w:val="24"/>
           <w:szCs w:val="24"/>
         </w:rPr>
-        <w:t>RN02. Convenio Activo</w:t>
+        <w:t xml:space="preserve">RN02. </w:t>
       </w:r>
       <w:bookmarkEnd w:id="42"/>
       <w:r>
@@ -6166,7 +6347,7 @@
           <w:sz w:val="24"/>
           <w:szCs w:val="24"/>
         </w:rPr>
-        <w:t xml:space="preserve">  </w:t>
+        <w:t>Vigencia del Acuerdo</w:t>
       </w:r>
     </w:p>
     <w:p>
@@ -6180,7 +6361,7 @@
         <w:rPr>
           <w:sz w:val="24"/>
         </w:rPr>
-        <w:t>El consumo solo podrá registrarse si existe un convenio activo entre la empresa del empleado y el restaurante.</w:t>
+        <w:t>Todo acuerdo debe tener una fecha de inicio y fin válida.</w:t>
       </w:r>
     </w:p>
     <w:p>
@@ -6197,7 +6378,7 @@
           <w:sz w:val="24"/>
           <w:szCs w:val="24"/>
         </w:rPr>
-        <w:t>RN03. Cálculo de Consumo</w:t>
+        <w:t xml:space="preserve">RN03. </w:t>
       </w:r>
       <w:bookmarkEnd w:id="43"/>
       <w:r>
@@ -6205,7 +6386,7 @@
           <w:sz w:val="24"/>
           <w:szCs w:val="24"/>
         </w:rPr>
-        <w:t xml:space="preserve"> </w:t>
+        <w:t>Unicidad de Acuerdo</w:t>
       </w:r>
     </w:p>
     <w:p>
@@ -6219,21 +6400,13 @@
         <w:rPr>
           <w:sz w:val="24"/>
         </w:rPr>
-        <w:t xml:space="preserve">El monto del consumo debe calcularse en función del tipo de convenio establecido (prepago, </w:t>
-      </w:r>
-      <w:proofErr w:type="spellStart"/>
+        <w:t>No pueden existir acuerdos duplicados activos entre la misma empresa y restaurante</w:t>
+      </w:r>
       <w:r>
         <w:rPr>
           <w:sz w:val="24"/>
         </w:rPr>
-        <w:t>postpago</w:t>
-      </w:r>
-      <w:proofErr w:type="spellEnd"/>
-      <w:r>
-        <w:rPr>
-          <w:sz w:val="24"/>
-        </w:rPr>
-        <w:t xml:space="preserve"> o mixto).</w:t>
+        <w:t>.</w:t>
       </w:r>
     </w:p>
     <w:p>
@@ -6250,16 +6423,16 @@
           <w:sz w:val="24"/>
           <w:szCs w:val="24"/>
         </w:rPr>
-        <w:t>RN04. Registro Único de Consum</w:t>
-      </w:r>
+        <w:t xml:space="preserve">RN04. </w:t>
+      </w:r>
+      <w:bookmarkEnd w:id="44"/>
       <w:r>
         <w:rPr>
           <w:sz w:val="24"/>
           <w:szCs w:val="24"/>
         </w:rPr>
-        <w:t>o</w:t>
-      </w:r>
-      <w:bookmarkEnd w:id="44"/>
+        <w:t>Tipo de Convenio</w:t>
+      </w:r>
     </w:p>
     <w:p>
       <w:pPr>
@@ -6272,7 +6445,13 @@
         <w:rPr>
           <w:sz w:val="24"/>
         </w:rPr>
-        <w:t>Cada consumo debe registrarse una única vez y quedar asociado al empleado, restaurante y convenio correspondiente.</w:t>
+        <w:t>El acuerdo debe definir un tipo válido (prepago, postpago o mixto)</w:t>
+      </w:r>
+      <w:r>
+        <w:rPr>
+          <w:sz w:val="24"/>
+        </w:rPr>
+        <w:t>.</w:t>
       </w:r>
     </w:p>
     <w:p>
@@ -6287,6 +6466,7 @@
       <w:bookmarkStart w:id="46" w:name="_Toc227178528"/>
       <w:bookmarkEnd w:id="41"/>
       <w:r>
+        <w:lastRenderedPageBreak/>
         <w:t>Requerimientos Especiales</w:t>
       </w:r>
       <w:bookmarkEnd w:id="38"/>
@@ -6317,7 +6497,10 @@
     </w:p>
     <w:p>
       <w:r>
-        <w:t>El sistema debe garantizar autenticación y autorización mediante mecanismos seguros para evitar accesos no autorizados.</w:t>
+        <w:t>Solo usuarios autorizados pueden crear acuerdos</w:t>
+      </w:r>
+      <w:r>
+        <w:t>.</w:t>
       </w:r>
     </w:p>
     <w:p>
@@ -6344,7 +6527,10 @@
     </w:p>
     <w:p>
       <w:r>
-        <w:t>La validación del código QR y el registro del consumo deben ejecutarse en un tiempo menor a 2 segundos.</w:t>
+        <w:t>El registro debe completarse en menos de 2 segundos</w:t>
+      </w:r>
+      <w:r>
+        <w:t>.</w:t>
       </w:r>
     </w:p>
     <w:p>
@@ -6371,7 +6557,10 @@
     </w:p>
     <w:p>
       <w:r>
-        <w:t>El sistema debe estar disponible para el registro de consumos en horarios operativos sin interrupciones.</w:t>
+        <w:t>El sistema debe permitir la creación de acuerdos en todo momento</w:t>
+      </w:r>
+      <w:r>
+        <w:t>.</w:t>
       </w:r>
     </w:p>
     <w:p>
@@ -6398,7 +6587,10 @@
     </w:p>
     <w:p>
       <w:r>
-        <w:t>La interfaz debe ser intuitiva y permitir al restaurante realizar el registro del consumo de forma rápida y sencilla.</w:t>
+        <w:t>La interfaz debe facilitar la configuración del acuerdo</w:t>
+      </w:r>
+      <w:r>
+        <w:t>.</w:t>
       </w:r>
     </w:p>
     <w:p>
@@ -6425,7 +6617,10 @@
     </w:p>
     <w:p>
       <w:r>
-        <w:t>El sistema debe garantizar que la información registrada sea consistente y no presente duplicidad en los consumos.</w:t>
+        <w:t>El sistema debe evitar inconsistencias en los acuerdos registrados</w:t>
+      </w:r>
+      <w:r>
+        <w:t>.</w:t>
       </w:r>
     </w:p>
     <w:p>
@@ -6438,14 +6633,22 @@
       </w:pPr>
       <w:bookmarkStart w:id="52" w:name="_Toc296587041"/>
       <w:bookmarkStart w:id="53" w:name="_Toc227178534"/>
-      <w:proofErr w:type="spellStart"/>
-      <w:r>
-        <w:lastRenderedPageBreak/>
+      <w:r>
         <w:t>Poscondiciones</w:t>
       </w:r>
       <w:bookmarkEnd w:id="52"/>
       <w:bookmarkEnd w:id="53"/>
-      <w:proofErr w:type="spellEnd"/>
+    </w:p>
+    <w:p>
+      <w:bookmarkStart w:id="54" w:name="_Toc296587043"/>
+      <w:r>
+        <w:t>Una vez creado el acuerdo, este queda disponible para ser utilizado en el sistema.</w:t>
+      </w:r>
+    </w:p>
+    <w:p>
+      <w:pPr>
+        <w:ind w:left="720"/>
+      </w:pPr>
     </w:p>
     <w:p>
       <w:pPr>
@@ -6454,9 +6657,8 @@
           <w:numId w:val="13"/>
         </w:numPr>
       </w:pPr>
-      <w:bookmarkStart w:id="54" w:name="_Toc296587043"/>
-      <w:r>
-        <w:t>El consumo queda registrado correctamente en el sistema</w:t>
+      <w:r>
+        <w:t>El acuerdo queda registrado en la base de datos</w:t>
       </w:r>
     </w:p>
     <w:p>
@@ -6467,7 +6669,7 @@
         </w:numPr>
       </w:pPr>
       <w:r>
-        <w:t>La información del consumo se almacena en la base de datos</w:t>
+        <w:t>El acuerdo queda activo dentro de su vigencia</w:t>
       </w:r>
     </w:p>
     <w:p>
@@ -6478,7 +6680,7 @@
         </w:numPr>
       </w:pPr>
       <w:r>
-        <w:t>El consumo queda asociado al empleado, restaurante y convenio</w:t>
+        <w:t>Se habilita el consumo para empleados asociados</w:t>
       </w:r>
     </w:p>
     <w:p>
@@ -6489,7 +6691,7 @@
         </w:numPr>
       </w:pPr>
       <w:r>
-        <w:t>Se actualizan los datos para reportes y facturación</w:t>
+        <w:t>El acuerdo puede ser utilizado en el registro de consumos</w:t>
       </w:r>
     </w:p>
     <w:p>
@@ -6500,7 +6702,10 @@
         </w:numPr>
       </w:pPr>
       <w:r>
-        <w:t>El sistema confirma la finalización del proceso al usuario</w:t>
+        <w:t>El sistema confirma la creación</w:t>
+      </w:r>
+      <w:r>
+        <w:t>.</w:t>
       </w:r>
     </w:p>
     <w:p>
@@ -6518,49 +6723,48 @@
       <w:bookmarkEnd w:id="54"/>
       <w:bookmarkEnd w:id="55"/>
     </w:p>
+    <w:p>
+      <w:r>
+        <w:t>En este apartado se identifican los casos de uso relacionados con la creación de acuerdos dentro del sistema.</w:t>
+      </w:r>
+    </w:p>
     <w:tbl>
       <w:tblPr>
+        <w:tblStyle w:val="Tablaconcuadrcula2-nfasis1"/>
         <w:tblW w:w="0" w:type="auto"/>
-        <w:tblInd w:w="1101" w:type="dxa"/>
-        <w:tblBorders>
-          <w:top w:val="single" w:sz="4" w:space="0" w:color="auto"/>
-          <w:left w:val="single" w:sz="4" w:space="0" w:color="auto"/>
-          <w:bottom w:val="single" w:sz="4" w:space="0" w:color="auto"/>
-          <w:right w:val="single" w:sz="4" w:space="0" w:color="auto"/>
-          <w:insideH w:val="single" w:sz="4" w:space="0" w:color="auto"/>
-          <w:insideV w:val="single" w:sz="4" w:space="0" w:color="auto"/>
-        </w:tblBorders>
-        <w:tblLook w:val="01E0" w:firstRow="1" w:lastRow="1" w:firstColumn="1" w:lastColumn="1" w:noHBand="0" w:noVBand="0"/>
+        <w:jc w:val="center"/>
+        <w:tblLook w:val="04A0" w:firstRow="1" w:lastRow="0" w:firstColumn="1" w:lastColumn="0" w:noHBand="0" w:noVBand="1"/>
       </w:tblPr>
       <w:tblGrid>
-        <w:gridCol w:w="3554"/>
-        <w:gridCol w:w="3720"/>
+        <w:gridCol w:w="3164"/>
+        <w:gridCol w:w="1910"/>
       </w:tblGrid>
       <w:tr>
         <w:trPr>
-          <w:trHeight w:val="333"/>
+          <w:cnfStyle w:val="100000000000" w:firstRow="1" w:lastRow="0" w:firstColumn="0" w:lastColumn="0" w:oddVBand="0" w:evenVBand="0" w:oddHBand="0" w:evenHBand="0" w:firstRowFirstColumn="0" w:firstRowLastColumn="0" w:lastRowFirstColumn="0" w:lastRowLastColumn="0"/>
+          <w:jc w:val="center"/>
         </w:trPr>
         <w:tc>
           <w:tcPr>
-            <w:tcW w:w="3554" w:type="dxa"/>
-            <w:shd w:val="clear" w:color="auto" w:fill="B8CCE4"/>
-            <w:vAlign w:val="center"/>
+            <w:cnfStyle w:val="001000000000" w:firstRow="0" w:lastRow="0" w:firstColumn="1" w:lastColumn="0" w:oddVBand="0" w:evenVBand="0" w:oddHBand="0" w:evenHBand="0" w:firstRowFirstColumn="0" w:firstRowLastColumn="0" w:lastRowFirstColumn="0" w:lastRowLastColumn="0"/>
+            <w:tcW w:w="0" w:type="auto"/>
+            <w:hideMark/>
           </w:tcPr>
           <w:p>
             <w:pPr>
               <w:suppressAutoHyphens w:val="0"/>
               <w:jc w:val="center"/>
               <w:rPr>
-                <w:rFonts w:ascii="Times New Roman" w:hAnsi="Times New Roman"/>
-                <w:b/>
-                <w:bCs/>
+                <w:rFonts w:cs="Arial"/>
+                <w:sz w:val="24"/>
                 <w:lang w:eastAsia="es-EC"/>
               </w:rPr>
             </w:pPr>
             <w:r>
               <w:rPr>
-                <w:b/>
-                <w:bCs/>
+                <w:rFonts w:cs="Arial"/>
+                <w:sz w:val="24"/>
+                <w:lang w:eastAsia="es-EC"/>
               </w:rPr>
               <w:t>Nombre Caso de uso</w:t>
             </w:r>
@@ -6568,22 +6772,25 @@
         </w:tc>
         <w:tc>
           <w:tcPr>
-            <w:tcW w:w="3720" w:type="dxa"/>
-            <w:shd w:val="clear" w:color="auto" w:fill="B8CCE4"/>
-            <w:vAlign w:val="center"/>
+            <w:tcW w:w="0" w:type="auto"/>
+            <w:hideMark/>
           </w:tcPr>
           <w:p>
             <w:pPr>
+              <w:suppressAutoHyphens w:val="0"/>
               <w:jc w:val="center"/>
+              <w:cnfStyle w:val="100000000000" w:firstRow="1" w:lastRow="0" w:firstColumn="0" w:lastColumn="0" w:oddVBand="0" w:evenVBand="0" w:oddHBand="0" w:evenHBand="0" w:firstRowFirstColumn="0" w:firstRowLastColumn="0" w:lastRowFirstColumn="0" w:lastRowLastColumn="0"/>
               <w:rPr>
-                <w:b/>
-                <w:bCs/>
+                <w:rFonts w:cs="Arial"/>
+                <w:sz w:val="24"/>
+                <w:lang w:eastAsia="es-EC"/>
               </w:rPr>
             </w:pPr>
             <w:r>
               <w:rPr>
-                <w:b/>
-                <w:bCs/>
+                <w:rFonts w:cs="Arial"/>
+                <w:sz w:val="24"/>
+                <w:lang w:eastAsia="es-EC"/>
               </w:rPr>
               <w:t>Obligatoriedad</w:t>
             </w:r>
@@ -6592,29 +6799,172 @@
       </w:tr>
       <w:tr>
         <w:trPr>
-          <w:trHeight w:val="355"/>
+          <w:cnfStyle w:val="000000100000" w:firstRow="0" w:lastRow="0" w:firstColumn="0" w:lastColumn="0" w:oddVBand="0" w:evenVBand="0" w:oddHBand="1" w:evenHBand="0" w:firstRowFirstColumn="0" w:firstRowLastColumn="0" w:lastRowFirstColumn="0" w:lastRowLastColumn="0"/>
+          <w:jc w:val="center"/>
         </w:trPr>
         <w:tc>
           <w:tcPr>
-            <w:tcW w:w="3554" w:type="dxa"/>
-            <w:vAlign w:val="center"/>
+            <w:cnfStyle w:val="001000000000" w:firstRow="0" w:lastRow="0" w:firstColumn="1" w:lastColumn="0" w:oddVBand="0" w:evenVBand="0" w:oddHBand="0" w:evenHBand="0" w:firstRowFirstColumn="0" w:firstRowLastColumn="0" w:lastRowFirstColumn="0" w:lastRowLastColumn="0"/>
+            <w:tcW w:w="0" w:type="auto"/>
+            <w:hideMark/>
           </w:tcPr>
           <w:p>
             <w:pPr>
+              <w:suppressAutoHyphens w:val="0"/>
               <w:jc w:val="left"/>
+              <w:rPr>
+                <w:rFonts w:cs="Arial"/>
+                <w:sz w:val="24"/>
+                <w:lang w:eastAsia="es-EC"/>
+              </w:rPr>
             </w:pPr>
             <w:r>
-              <w:t>Registro de usuario</w:t>
+              <w:rPr>
+                <w:rFonts w:cs="Arial"/>
+                <w:sz w:val="24"/>
+                <w:lang w:eastAsia="es-EC"/>
+              </w:rPr>
+              <w:t>Registro de empresa</w:t>
             </w:r>
           </w:p>
         </w:tc>
         <w:tc>
           <w:tcPr>
-            <w:tcW w:w="3720" w:type="dxa"/>
-            <w:vAlign w:val="center"/>
+            <w:tcW w:w="0" w:type="auto"/>
+            <w:hideMark/>
           </w:tcPr>
           <w:p>
+            <w:pPr>
+              <w:suppressAutoHyphens w:val="0"/>
+              <w:jc w:val="left"/>
+              <w:cnfStyle w:val="000000100000" w:firstRow="0" w:lastRow="0" w:firstColumn="0" w:lastColumn="0" w:oddVBand="0" w:evenVBand="0" w:oddHBand="1" w:evenHBand="0" w:firstRowFirstColumn="0" w:firstRowLastColumn="0" w:lastRowFirstColumn="0" w:lastRowLastColumn="0"/>
+              <w:rPr>
+                <w:rFonts w:cs="Arial"/>
+                <w:sz w:val="24"/>
+                <w:lang w:eastAsia="es-EC"/>
+              </w:rPr>
+            </w:pPr>
             <w:r>
+              <w:rPr>
+                <w:rFonts w:cs="Arial"/>
+                <w:sz w:val="24"/>
+                <w:lang w:eastAsia="es-EC"/>
+              </w:rPr>
+              <w:t>Obligatorio</w:t>
+            </w:r>
+          </w:p>
+        </w:tc>
+      </w:tr>
+      <w:tr>
+        <w:trPr>
+          <w:jc w:val="center"/>
+        </w:trPr>
+        <w:tc>
+          <w:tcPr>
+            <w:cnfStyle w:val="001000000000" w:firstRow="0" w:lastRow="0" w:firstColumn="1" w:lastColumn="0" w:oddVBand="0" w:evenVBand="0" w:oddHBand="0" w:evenHBand="0" w:firstRowFirstColumn="0" w:firstRowLastColumn="0" w:lastRowFirstColumn="0" w:lastRowLastColumn="0"/>
+            <w:tcW w:w="0" w:type="auto"/>
+            <w:hideMark/>
+          </w:tcPr>
+          <w:p>
+            <w:pPr>
+              <w:suppressAutoHyphens w:val="0"/>
+              <w:jc w:val="left"/>
+              <w:rPr>
+                <w:rFonts w:cs="Arial"/>
+                <w:sz w:val="24"/>
+                <w:lang w:eastAsia="es-EC"/>
+              </w:rPr>
+            </w:pPr>
+            <w:r>
+              <w:rPr>
+                <w:rFonts w:cs="Arial"/>
+                <w:sz w:val="24"/>
+                <w:lang w:eastAsia="es-EC"/>
+              </w:rPr>
+              <w:t>Registro de restaurante</w:t>
+            </w:r>
+          </w:p>
+        </w:tc>
+        <w:tc>
+          <w:tcPr>
+            <w:tcW w:w="0" w:type="auto"/>
+            <w:hideMark/>
+          </w:tcPr>
+          <w:p>
+            <w:pPr>
+              <w:suppressAutoHyphens w:val="0"/>
+              <w:jc w:val="left"/>
+              <w:cnfStyle w:val="000000000000" w:firstRow="0" w:lastRow="0" w:firstColumn="0" w:lastColumn="0" w:oddVBand="0" w:evenVBand="0" w:oddHBand="0" w:evenHBand="0" w:firstRowFirstColumn="0" w:firstRowLastColumn="0" w:lastRowFirstColumn="0" w:lastRowLastColumn="0"/>
+              <w:rPr>
+                <w:rFonts w:cs="Arial"/>
+                <w:sz w:val="24"/>
+                <w:lang w:eastAsia="es-EC"/>
+              </w:rPr>
+            </w:pPr>
+            <w:r>
+              <w:rPr>
+                <w:rFonts w:cs="Arial"/>
+                <w:sz w:val="24"/>
+                <w:lang w:eastAsia="es-EC"/>
+              </w:rPr>
+              <w:t>Obligatorio</w:t>
+            </w:r>
+          </w:p>
+        </w:tc>
+      </w:tr>
+      <w:tr>
+        <w:trPr>
+          <w:cnfStyle w:val="000000100000" w:firstRow="0" w:lastRow="0" w:firstColumn="0" w:lastColumn="0" w:oddVBand="0" w:evenVBand="0" w:oddHBand="1" w:evenHBand="0" w:firstRowFirstColumn="0" w:firstRowLastColumn="0" w:lastRowFirstColumn="0" w:lastRowLastColumn="0"/>
+          <w:jc w:val="center"/>
+        </w:trPr>
+        <w:tc>
+          <w:tcPr>
+            <w:cnfStyle w:val="001000000000" w:firstRow="0" w:lastRow="0" w:firstColumn="1" w:lastColumn="0" w:oddVBand="0" w:evenVBand="0" w:oddHBand="0" w:evenHBand="0" w:firstRowFirstColumn="0" w:firstRowLastColumn="0" w:lastRowFirstColumn="0" w:lastRowLastColumn="0"/>
+            <w:tcW w:w="0" w:type="auto"/>
+            <w:hideMark/>
+          </w:tcPr>
+          <w:p>
+            <w:pPr>
+              <w:suppressAutoHyphens w:val="0"/>
+              <w:jc w:val="left"/>
+              <w:rPr>
+                <w:rFonts w:cs="Arial"/>
+                <w:sz w:val="24"/>
+                <w:lang w:eastAsia="es-EC"/>
+              </w:rPr>
+            </w:pPr>
+            <w:r>
+              <w:rPr>
+                <w:rFonts w:cs="Arial"/>
+                <w:sz w:val="24"/>
+                <w:lang w:eastAsia="es-EC"/>
+              </w:rPr>
+              <w:t>Registro de empleados</w:t>
+            </w:r>
+          </w:p>
+        </w:tc>
+        <w:tc>
+          <w:tcPr>
+            <w:tcW w:w="0" w:type="auto"/>
+            <w:hideMark/>
+          </w:tcPr>
+          <w:p>
+            <w:pPr>
+              <w:suppressAutoHyphens w:val="0"/>
+              <w:jc w:val="left"/>
+              <w:cnfStyle w:val="000000100000" w:firstRow="0" w:lastRow="0" w:firstColumn="0" w:lastColumn="0" w:oddVBand="0" w:evenVBand="0" w:oddHBand="1" w:evenHBand="0" w:firstRowFirstColumn="0" w:firstRowLastColumn="0" w:lastRowFirstColumn="0" w:lastRowLastColumn="0"/>
+              <w:rPr>
+                <w:rFonts w:cs="Arial"/>
+                <w:sz w:val="24"/>
+                <w:lang w:eastAsia="es-EC"/>
+              </w:rPr>
+            </w:pPr>
+            <w:r>
+              <w:rPr>
+                <w:rFonts w:cs="Arial"/>
+                <w:sz w:val="24"/>
+                <w:lang w:eastAsia="es-EC"/>
+              </w:rPr>
               <w:t>Opcional</w:t>
             </w:r>
           </w:p>
@@ -6622,26 +6972,56 @@
       </w:tr>
       <w:tr>
         <w:trPr>
-          <w:trHeight w:val="355"/>
+          <w:jc w:val="center"/>
         </w:trPr>
         <w:tc>
           <w:tcPr>
-            <w:tcW w:w="3554" w:type="dxa"/>
-            <w:vAlign w:val="center"/>
+            <w:cnfStyle w:val="001000000000" w:firstRow="0" w:lastRow="0" w:firstColumn="1" w:lastColumn="0" w:oddVBand="0" w:evenVBand="0" w:oddHBand="0" w:evenHBand="0" w:firstRowFirstColumn="0" w:firstRowLastColumn="0" w:lastRowFirstColumn="0" w:lastRowLastColumn="0"/>
+            <w:tcW w:w="0" w:type="auto"/>
+            <w:hideMark/>
           </w:tcPr>
           <w:p>
+            <w:pPr>
+              <w:suppressAutoHyphens w:val="0"/>
+              <w:jc w:val="left"/>
+              <w:rPr>
+                <w:rFonts w:cs="Arial"/>
+                <w:sz w:val="24"/>
+                <w:lang w:eastAsia="es-EC"/>
+              </w:rPr>
+            </w:pPr>
             <w:r>
-              <w:t>Registro de empresa</w:t>
+              <w:rPr>
+                <w:rFonts w:cs="Arial"/>
+                <w:sz w:val="24"/>
+                <w:lang w:eastAsia="es-EC"/>
+              </w:rPr>
+              <w:t>Generación de código QR</w:t>
             </w:r>
           </w:p>
         </w:tc>
         <w:tc>
           <w:tcPr>
-            <w:tcW w:w="3720" w:type="dxa"/>
-            <w:vAlign w:val="center"/>
+            <w:tcW w:w="0" w:type="auto"/>
+            <w:hideMark/>
           </w:tcPr>
           <w:p>
+            <w:pPr>
+              <w:suppressAutoHyphens w:val="0"/>
+              <w:jc w:val="left"/>
+              <w:cnfStyle w:val="000000000000" w:firstRow="0" w:lastRow="0" w:firstColumn="0" w:lastColumn="0" w:oddVBand="0" w:evenVBand="0" w:oddHBand="0" w:evenHBand="0" w:firstRowFirstColumn="0" w:firstRowLastColumn="0" w:lastRowFirstColumn="0" w:lastRowLastColumn="0"/>
+              <w:rPr>
+                <w:rFonts w:cs="Arial"/>
+                <w:sz w:val="24"/>
+                <w:lang w:eastAsia="es-EC"/>
+              </w:rPr>
+            </w:pPr>
             <w:r>
+              <w:rPr>
+                <w:rFonts w:cs="Arial"/>
+                <w:sz w:val="24"/>
+                <w:lang w:eastAsia="es-EC"/>
+              </w:rPr>
               <w:t>Opcional</w:t>
             </w:r>
           </w:p>
@@ -6649,140 +7029,64 @@
       </w:tr>
       <w:tr>
         <w:trPr>
-          <w:trHeight w:val="355"/>
+          <w:cnfStyle w:val="000000100000" w:firstRow="0" w:lastRow="0" w:firstColumn="0" w:lastColumn="0" w:oddVBand="0" w:evenVBand="0" w:oddHBand="1" w:evenHBand="0" w:firstRowFirstColumn="0" w:firstRowLastColumn="0" w:lastRowFirstColumn="0" w:lastRowLastColumn="0"/>
+          <w:jc w:val="center"/>
         </w:trPr>
         <w:tc>
           <w:tcPr>
-            <w:tcW w:w="3554" w:type="dxa"/>
-            <w:vAlign w:val="center"/>
+            <w:cnfStyle w:val="001000000000" w:firstRow="0" w:lastRow="0" w:firstColumn="1" w:lastColumn="0" w:oddVBand="0" w:evenVBand="0" w:oddHBand="0" w:evenHBand="0" w:firstRowFirstColumn="0" w:firstRowLastColumn="0" w:lastRowFirstColumn="0" w:lastRowLastColumn="0"/>
+            <w:tcW w:w="0" w:type="auto"/>
+            <w:hideMark/>
           </w:tcPr>
           <w:p>
+            <w:pPr>
+              <w:suppressAutoHyphens w:val="0"/>
+              <w:jc w:val="left"/>
+              <w:rPr>
+                <w:rFonts w:cs="Arial"/>
+                <w:sz w:val="24"/>
+                <w:lang w:eastAsia="es-EC"/>
+              </w:rPr>
+            </w:pPr>
             <w:r>
-              <w:t>Registro de empleados</w:t>
+              <w:rPr>
+                <w:rFonts w:cs="Arial"/>
+                <w:sz w:val="24"/>
+                <w:lang w:eastAsia="es-EC"/>
+              </w:rPr>
+              <w:t>Registro de consumo</w:t>
             </w:r>
           </w:p>
         </w:tc>
         <w:tc>
           <w:tcPr>
-            <w:tcW w:w="3720" w:type="dxa"/>
-            <w:vAlign w:val="center"/>
+            <w:tcW w:w="0" w:type="auto"/>
+            <w:hideMark/>
           </w:tcPr>
           <w:p>
+            <w:pPr>
+              <w:suppressAutoHyphens w:val="0"/>
+              <w:jc w:val="left"/>
+              <w:cnfStyle w:val="000000100000" w:firstRow="0" w:lastRow="0" w:firstColumn="0" w:lastColumn="0" w:oddVBand="0" w:evenVBand="0" w:oddHBand="1" w:evenHBand="0" w:firstRowFirstColumn="0" w:firstRowLastColumn="0" w:lastRowFirstColumn="0" w:lastRowLastColumn="0"/>
+              <w:rPr>
+                <w:rFonts w:cs="Arial"/>
+                <w:sz w:val="24"/>
+                <w:lang w:eastAsia="es-EC"/>
+              </w:rPr>
+            </w:pPr>
             <w:r>
+              <w:rPr>
+                <w:rFonts w:cs="Arial"/>
+                <w:sz w:val="24"/>
+                <w:lang w:eastAsia="es-EC"/>
+              </w:rPr>
               <w:t>Obligatorio</w:t>
             </w:r>
           </w:p>
         </w:tc>
       </w:tr>
-      <w:tr>
-        <w:trPr>
-          <w:trHeight w:val="355"/>
-        </w:trPr>
-        <w:tc>
-          <w:tcPr>
-            <w:tcW w:w="3554" w:type="dxa"/>
-            <w:vAlign w:val="center"/>
-          </w:tcPr>
-          <w:p>
-            <w:r>
-              <w:t>Generación de código QR</w:t>
-            </w:r>
-          </w:p>
-        </w:tc>
-        <w:tc>
-          <w:tcPr>
-            <w:tcW w:w="3720" w:type="dxa"/>
-            <w:vAlign w:val="center"/>
-          </w:tcPr>
-          <w:p>
-            <w:r>
-              <w:t>Obligatorio</w:t>
-            </w:r>
-          </w:p>
-        </w:tc>
-      </w:tr>
-      <w:tr>
-        <w:trPr>
-          <w:trHeight w:val="355"/>
-        </w:trPr>
-        <w:tc>
-          <w:tcPr>
-            <w:tcW w:w="3554" w:type="dxa"/>
-            <w:vAlign w:val="center"/>
-          </w:tcPr>
-          <w:p>
-            <w:r>
-              <w:t>Registro de restaurante</w:t>
-            </w:r>
-          </w:p>
-        </w:tc>
-        <w:tc>
-          <w:tcPr>
-            <w:tcW w:w="3720" w:type="dxa"/>
-            <w:vAlign w:val="center"/>
-          </w:tcPr>
-          <w:p>
-            <w:r>
-              <w:t>Obligatorio</w:t>
-            </w:r>
-          </w:p>
-        </w:tc>
-      </w:tr>
-      <w:tr>
-        <w:trPr>
-          <w:trHeight w:val="355"/>
-        </w:trPr>
-        <w:tc>
-          <w:tcPr>
-            <w:tcW w:w="3554" w:type="dxa"/>
-            <w:vAlign w:val="center"/>
-          </w:tcPr>
-          <w:p>
-            <w:r>
-              <w:t>Configuración de convenio</w:t>
-            </w:r>
-          </w:p>
-        </w:tc>
-        <w:tc>
-          <w:tcPr>
-            <w:tcW w:w="3720" w:type="dxa"/>
-            <w:vAlign w:val="center"/>
-          </w:tcPr>
-          <w:p>
-            <w:r>
-              <w:t>Obligatorio</w:t>
-            </w:r>
-          </w:p>
-        </w:tc>
-      </w:tr>
-      <w:tr>
-        <w:trPr>
-          <w:trHeight w:val="355"/>
-        </w:trPr>
-        <w:tc>
-          <w:tcPr>
-            <w:tcW w:w="3554" w:type="dxa"/>
-            <w:vAlign w:val="center"/>
-          </w:tcPr>
-          <w:p>
-            <w:r>
-              <w:t>Consulta de reportes</w:t>
-            </w:r>
-          </w:p>
-        </w:tc>
-        <w:tc>
-          <w:tcPr>
-            <w:tcW w:w="3720" w:type="dxa"/>
-            <w:vAlign w:val="center"/>
-          </w:tcPr>
-          <w:p>
-            <w:r>
-              <w:t>Opcional</w:t>
-            </w:r>
-          </w:p>
-        </w:tc>
-      </w:tr>
     </w:tbl>
+    <w:p/>
     <w:p>
       <w:pPr>
         <w:pStyle w:val="Ttulo1"/>
@@ -6840,20 +7144,16 @@
           <w:sz w:val="24"/>
           <w:szCs w:val="24"/>
         </w:rPr>
-        <w:t xml:space="preserve"> UC01</w:t>
-      </w:r>
-      <w:r>
         <w:t xml:space="preserve"> </w:t>
       </w:r>
-      <w:r>
-        <w:rPr>
-          <w:i w:val="0"/>
+      <w:bookmarkEnd w:id="59"/>
+      <w:r>
+        <w:rPr>
           <w:sz w:val="24"/>
           <w:szCs w:val="24"/>
         </w:rPr>
-        <w:t>Registrar Consumo de mediante QR</w:t>
-      </w:r>
-      <w:bookmarkEnd w:id="59"/>
+        <w:t>CU013 Crear Acuerdo Empresa – Restaurante</w:t>
+      </w:r>
     </w:p>
     <w:p>
       <w:pPr>
@@ -6861,29 +7161,18 @@
           <w:ilvl w:val="0"/>
           <w:numId w:val="14"/>
         </w:numPr>
-        <w:suppressAutoHyphens w:val="0"/>
-        <w:jc w:val="left"/>
         <w:rPr>
           <w:rFonts w:cs="Arial"/>
           <w:lang w:eastAsia="es-EC"/>
         </w:rPr>
       </w:pPr>
       <w:bookmarkStart w:id="60" w:name="_Toc296587056"/>
-      <w:proofErr w:type="spellStart"/>
       <w:r>
         <w:rPr>
           <w:rFonts w:cs="Arial"/>
           <w:lang w:eastAsia="es-EC"/>
         </w:rPr>
-        <w:t>QR_Generado</w:t>
-      </w:r>
-      <w:proofErr w:type="spellEnd"/>
-      <w:r>
-        <w:rPr>
-          <w:rFonts w:cs="Arial"/>
-          <w:lang w:eastAsia="es-EC"/>
-        </w:rPr>
-        <w:t xml:space="preserve"> </w:t>
+        <w:t>Acuerdo_No_Existente</w:t>
       </w:r>
     </w:p>
     <w:p>
@@ -6892,28 +7181,17 @@
           <w:ilvl w:val="0"/>
           <w:numId w:val="14"/>
         </w:numPr>
-        <w:suppressAutoHyphens w:val="0"/>
-        <w:jc w:val="left"/>
         <w:rPr>
           <w:rFonts w:cs="Arial"/>
           <w:lang w:eastAsia="es-EC"/>
         </w:rPr>
       </w:pPr>
-      <w:proofErr w:type="spellStart"/>
       <w:r>
         <w:rPr>
           <w:rFonts w:cs="Arial"/>
           <w:lang w:eastAsia="es-EC"/>
         </w:rPr>
-        <w:t>QR_Validado</w:t>
-      </w:r>
-      <w:proofErr w:type="spellEnd"/>
-      <w:r>
-        <w:rPr>
-          <w:rFonts w:cs="Arial"/>
-          <w:lang w:eastAsia="es-EC"/>
-        </w:rPr>
-        <w:t xml:space="preserve"> </w:t>
+        <w:t>Datos_Validados</w:t>
       </w:r>
     </w:p>
     <w:p>
@@ -6922,28 +7200,18 @@
           <w:ilvl w:val="0"/>
           <w:numId w:val="14"/>
         </w:numPr>
-        <w:suppressAutoHyphens w:val="0"/>
-        <w:jc w:val="left"/>
         <w:rPr>
           <w:rFonts w:cs="Arial"/>
           <w:lang w:eastAsia="es-EC"/>
         </w:rPr>
       </w:pPr>
-      <w:proofErr w:type="spellStart"/>
       <w:r>
         <w:rPr>
           <w:rFonts w:cs="Arial"/>
           <w:lang w:eastAsia="es-EC"/>
         </w:rPr>
-        <w:t>Convenio_Verificado</w:t>
-      </w:r>
-      <w:proofErr w:type="spellEnd"/>
-      <w:r>
-        <w:rPr>
-          <w:rFonts w:cs="Arial"/>
-          <w:lang w:eastAsia="es-EC"/>
-        </w:rPr>
-        <w:t xml:space="preserve"> </w:t>
+        <w:lastRenderedPageBreak/>
+        <w:t>Acuerdo_Creado</w:t>
       </w:r>
     </w:p>
     <w:p>
@@ -6952,28 +7220,17 @@
           <w:ilvl w:val="0"/>
           <w:numId w:val="14"/>
         </w:numPr>
-        <w:suppressAutoHyphens w:val="0"/>
-        <w:jc w:val="left"/>
         <w:rPr>
           <w:rFonts w:cs="Arial"/>
           <w:lang w:eastAsia="es-EC"/>
         </w:rPr>
       </w:pPr>
-      <w:proofErr w:type="spellStart"/>
       <w:r>
         <w:rPr>
           <w:rFonts w:cs="Arial"/>
           <w:lang w:eastAsia="es-EC"/>
         </w:rPr>
-        <w:t>Consumo_Calculado</w:t>
-      </w:r>
-      <w:proofErr w:type="spellEnd"/>
-      <w:r>
-        <w:rPr>
-          <w:rFonts w:cs="Arial"/>
-          <w:lang w:eastAsia="es-EC"/>
-        </w:rPr>
-        <w:t xml:space="preserve"> </w:t>
+        <w:t>Acuerdo_Activo</w:t>
       </w:r>
     </w:p>
     <w:p>
@@ -6982,50 +7239,18 @@
           <w:ilvl w:val="0"/>
           <w:numId w:val="14"/>
         </w:numPr>
-        <w:suppressAutoHyphens w:val="0"/>
-        <w:jc w:val="left"/>
+        <w:rPr>
+          <w:rFonts w:cs="Arial"/>
+          <w:sz w:val="16"/>
+        </w:rPr>
+      </w:pPr>
+      <w:r>
         <w:rPr>
           <w:rFonts w:cs="Arial"/>
           <w:lang w:eastAsia="es-EC"/>
         </w:rPr>
-      </w:pPr>
-      <w:proofErr w:type="spellStart"/>
-      <w:r>
-        <w:rPr>
-          <w:rFonts w:cs="Arial"/>
-          <w:lang w:eastAsia="es-EC"/>
-        </w:rPr>
-        <w:t>Consumo_Registrado</w:t>
-      </w:r>
-      <w:proofErr w:type="spellEnd"/>
-      <w:r>
-        <w:rPr>
-          <w:rFonts w:cs="Arial"/>
-          <w:lang w:eastAsia="es-EC"/>
-        </w:rPr>
-        <w:t xml:space="preserve"> </w:t>
-      </w:r>
-    </w:p>
-    <w:p>
-      <w:pPr>
-        <w:numPr>
-          <w:ilvl w:val="0"/>
-          <w:numId w:val="14"/>
-        </w:numPr>
-        <w:rPr>
-          <w:rFonts w:cs="Arial"/>
-          <w:sz w:val="16"/>
-        </w:rPr>
-      </w:pPr>
-      <w:proofErr w:type="spellStart"/>
-      <w:r>
-        <w:rPr>
-          <w:rFonts w:cs="Arial"/>
-          <w:lang w:eastAsia="es-EC"/>
-        </w:rPr>
-        <w:t>Consumo_Rechazado</w:t>
-      </w:r>
-      <w:proofErr w:type="spellEnd"/>
+        <w:t>Acuerdo_Rechazado</w:t>
+      </w:r>
     </w:p>
     <w:p>
       <w:pPr>
@@ -7039,54 +7264,47 @@
       <w:r>
         <w:t>Anexos</w:t>
       </w:r>
+      <w:bookmarkStart w:id="62" w:name="_Toc296587057"/>
       <w:bookmarkEnd w:id="60"/>
       <w:bookmarkEnd w:id="61"/>
     </w:p>
     <w:p>
-      <w:bookmarkStart w:id="62" w:name="_Toc296587057"/>
-    </w:p>
-    <w:p/>
-    <w:p/>
-    <w:p>
       <w:pPr>
         <w:pStyle w:val="Ttulo2"/>
-        <w:numPr>
-          <w:ilvl w:val="0"/>
-          <w:numId w:val="0"/>
-        </w:numPr>
         <w:tabs>
           <w:tab w:val="left" w:pos="425"/>
         </w:tabs>
         <w:spacing w:before="200"/>
-        <w:ind w:left="425"/>
         <w:rPr>
           <w:i w:val="0"/>
           <w:sz w:val="24"/>
           <w:szCs w:val="24"/>
         </w:rPr>
       </w:pPr>
-    </w:p>
-    <w:p>
-      <w:pPr>
-        <w:pStyle w:val="Ttulo2"/>
-        <w:tabs>
-          <w:tab w:val="left" w:pos="425"/>
-        </w:tabs>
-        <w:spacing w:before="200"/>
+      <w:bookmarkStart w:id="63" w:name="_Toc227178539"/>
+      <w:r>
         <w:rPr>
           <w:i w:val="0"/>
           <w:sz w:val="24"/>
           <w:szCs w:val="24"/>
         </w:rPr>
-      </w:pPr>
-      <w:bookmarkStart w:id="63" w:name="_Toc227178539"/>
+        <w:t xml:space="preserve">Anexo 01. &lt; </w:t>
+      </w:r>
       <w:r>
         <w:rPr>
           <w:i w:val="0"/>
           <w:sz w:val="24"/>
           <w:szCs w:val="24"/>
         </w:rPr>
-        <w:t>Anexo 01. &lt; Anexo uno &gt;</w:t>
+        <w:t>Diagrama de Estados</w:t>
+      </w:r>
+      <w:r>
+        <w:rPr>
+          <w:i w:val="0"/>
+          <w:sz w:val="24"/>
+          <w:szCs w:val="24"/>
+        </w:rPr>
+        <w:t xml:space="preserve"> &gt;</w:t>
       </w:r>
       <w:bookmarkEnd w:id="62"/>
       <w:bookmarkEnd w:id="63"/>
@@ -7114,10 +7332,213 @@
           <w:lang w:val="es-ES_tradnl"/>
         </w:rPr>
       </w:pPr>
+      <w:r>
+        <w:rPr>
+          <w:b/>
+          <w:bCs/>
+          <w:sz w:val="36"/>
+        </w:rPr>
+        <w:drawing>
+          <wp:inline distT="0" distB="0" distL="0" distR="0" wp14:anchorId="67B465F9" wp14:editId="46F439F4">
+            <wp:extent cx="4648306" cy="6362700"/>
+            <wp:effectExtent l="0" t="0" r="0" b="0"/>
+            <wp:docPr id="1034" name="Picture 10">
+              <a:extLst xmlns:a="http://schemas.openxmlformats.org/drawingml/2006/main">
+                <a:ext uri="{FF2B5EF4-FFF2-40B4-BE49-F238E27FC236}">
+                  <a16:creationId xmlns:a16="http://schemas.microsoft.com/office/drawing/2014/main" id="{D4BF372A-5AAB-4A73-96E4-B0DB474B3879}"/>
+                </a:ext>
+              </a:extLst>
+            </wp:docPr>
+            <wp:cNvGraphicFramePr>
+              <a:graphicFrameLocks xmlns:a="http://schemas.openxmlformats.org/drawingml/2006/main" noChangeAspect="1"/>
+            </wp:cNvGraphicFramePr>
+            <a:graphic xmlns:a="http://schemas.openxmlformats.org/drawingml/2006/main">
+              <a:graphicData uri="http://schemas.openxmlformats.org/drawingml/2006/picture">
+                <pic:pic xmlns:pic="http://schemas.openxmlformats.org/drawingml/2006/picture">
+                  <pic:nvPicPr>
+                    <pic:cNvPr id="1034" name="Picture 10">
+                      <a:extLst>
+                        <a:ext uri="{FF2B5EF4-FFF2-40B4-BE49-F238E27FC236}">
+                          <a16:creationId xmlns:a16="http://schemas.microsoft.com/office/drawing/2014/main" id="{D4BF372A-5AAB-4A73-96E4-B0DB474B3879}"/>
+                        </a:ext>
+                      </a:extLst>
+                    </pic:cNvPr>
+                    <pic:cNvPicPr>
+                      <a:picLocks noChangeAspect="1" noChangeArrowheads="1"/>
+                    </pic:cNvPicPr>
+                  </pic:nvPicPr>
+                  <pic:blipFill>
+                    <a:blip r:embed="rId10">
+                      <a:extLst>
+                        <a:ext uri="{28A0092B-C50C-407E-A947-70E740481C1C}">
+                          <a14:useLocalDpi xmlns:a14="http://schemas.microsoft.com/office/drawing/2010/main" val="0"/>
+                        </a:ext>
+                      </a:extLst>
+                    </a:blip>
+                    <a:srcRect/>
+                    <a:stretch>
+                      <a:fillRect/>
+                    </a:stretch>
+                  </pic:blipFill>
+                  <pic:spPr bwMode="auto">
+                    <a:xfrm>
+                      <a:off x="0" y="0"/>
+                      <a:ext cx="4655208" cy="6372148"/>
+                    </a:xfrm>
+                    <a:prstGeom prst="rect">
+                      <a:avLst/>
+                    </a:prstGeom>
+                    <a:noFill/>
+                  </pic:spPr>
+                </pic:pic>
+              </a:graphicData>
+            </a:graphic>
+          </wp:inline>
+        </w:drawing>
+      </w:r>
+    </w:p>
+    <w:p>
+      <w:pPr>
+        <w:pStyle w:val="Ttulo2"/>
+        <w:tabs>
+          <w:tab w:val="left" w:pos="425"/>
+        </w:tabs>
+        <w:spacing w:before="200"/>
+        <w:rPr>
+          <w:i w:val="0"/>
+          <w:sz w:val="24"/>
+          <w:szCs w:val="24"/>
+        </w:rPr>
+      </w:pPr>
+      <w:r>
+        <w:rPr>
+          <w:i w:val="0"/>
+          <w:sz w:val="24"/>
+          <w:szCs w:val="24"/>
+        </w:rPr>
+        <w:lastRenderedPageBreak/>
+        <w:t>Anexo 0</w:t>
+      </w:r>
+      <w:r>
+        <w:rPr>
+          <w:i w:val="0"/>
+          <w:sz w:val="24"/>
+          <w:szCs w:val="24"/>
+        </w:rPr>
+        <w:t>2</w:t>
+      </w:r>
+      <w:r>
+        <w:rPr>
+          <w:i w:val="0"/>
+          <w:sz w:val="24"/>
+          <w:szCs w:val="24"/>
+        </w:rPr>
+        <w:t xml:space="preserve">. &lt; </w:t>
+      </w:r>
+      <w:r>
+        <w:rPr>
+          <w:i w:val="0"/>
+          <w:sz w:val="24"/>
+          <w:szCs w:val="24"/>
+        </w:rPr>
+        <w:t xml:space="preserve">Diagrama de </w:t>
+      </w:r>
+      <w:r>
+        <w:rPr>
+          <w:i w:val="0"/>
+          <w:sz w:val="24"/>
+          <w:szCs w:val="24"/>
+        </w:rPr>
+        <w:t>Actividades</w:t>
+      </w:r>
+      <w:r>
+        <w:rPr>
+          <w:i w:val="0"/>
+          <w:sz w:val="24"/>
+          <w:szCs w:val="24"/>
+        </w:rPr>
+        <w:t xml:space="preserve"> &gt;</w:t>
+      </w:r>
+    </w:p>
+    <w:p>
+      <w:pPr>
+        <w:spacing w:before="100"/>
+        <w:jc w:val="center"/>
+        <w:rPr>
+          <w:b/>
+          <w:bCs/>
+          <w:sz w:val="36"/>
+          <w:lang w:val="es-ES_tradnl"/>
+        </w:rPr>
+      </w:pPr>
+      <w:r>
+        <w:rPr>
+          <w:b/>
+          <w:bCs/>
+          <w:sz w:val="36"/>
+        </w:rPr>
+        <w:drawing>
+          <wp:inline distT="0" distB="0" distL="0" distR="0" wp14:anchorId="4DA9D189" wp14:editId="2427A882">
+            <wp:extent cx="5584825" cy="4126865"/>
+            <wp:effectExtent l="0" t="0" r="0" b="6985"/>
+            <wp:docPr id="1036" name="Picture 12" descr="PlantUML Diagram">
+              <a:extLst xmlns:a="http://schemas.openxmlformats.org/drawingml/2006/main">
+                <a:ext uri="{FF2B5EF4-FFF2-40B4-BE49-F238E27FC236}">
+                  <a16:creationId xmlns:a16="http://schemas.microsoft.com/office/drawing/2014/main" id="{B012117B-3BB1-4CD1-8E5C-B25720F49150}"/>
+                </a:ext>
+              </a:extLst>
+            </wp:docPr>
+            <wp:cNvGraphicFramePr>
+              <a:graphicFrameLocks xmlns:a="http://schemas.openxmlformats.org/drawingml/2006/main" noChangeAspect="1"/>
+            </wp:cNvGraphicFramePr>
+            <a:graphic xmlns:a="http://schemas.openxmlformats.org/drawingml/2006/main">
+              <a:graphicData uri="http://schemas.openxmlformats.org/drawingml/2006/picture">
+                <pic:pic xmlns:pic="http://schemas.openxmlformats.org/drawingml/2006/picture">
+                  <pic:nvPicPr>
+                    <pic:cNvPr id="1036" name="Picture 12" descr="PlantUML Diagram">
+                      <a:extLst>
+                        <a:ext uri="{FF2B5EF4-FFF2-40B4-BE49-F238E27FC236}">
+                          <a16:creationId xmlns:a16="http://schemas.microsoft.com/office/drawing/2014/main" id="{B012117B-3BB1-4CD1-8E5C-B25720F49150}"/>
+                        </a:ext>
+                      </a:extLst>
+                    </pic:cNvPr>
+                    <pic:cNvPicPr>
+                      <a:picLocks noChangeAspect="1" noChangeArrowheads="1"/>
+                    </pic:cNvPicPr>
+                  </pic:nvPicPr>
+                  <pic:blipFill>
+                    <a:blip r:embed="rId11">
+                      <a:extLst>
+                        <a:ext uri="{28A0092B-C50C-407E-A947-70E740481C1C}">
+                          <a14:useLocalDpi xmlns:a14="http://schemas.microsoft.com/office/drawing/2010/main" val="0"/>
+                        </a:ext>
+                      </a:extLst>
+                    </a:blip>
+                    <a:srcRect/>
+                    <a:stretch>
+                      <a:fillRect/>
+                    </a:stretch>
+                  </pic:blipFill>
+                  <pic:spPr bwMode="auto">
+                    <a:xfrm>
+                      <a:off x="0" y="0"/>
+                      <a:ext cx="5584825" cy="4126865"/>
+                    </a:xfrm>
+                    <a:prstGeom prst="rect">
+                      <a:avLst/>
+                    </a:prstGeom>
+                    <a:noFill/>
+                  </pic:spPr>
+                </pic:pic>
+              </a:graphicData>
+            </a:graphic>
+          </wp:inline>
+        </w:drawing>
+      </w:r>
     </w:p>
     <w:sectPr>
-      <w:headerReference w:type="default" r:id="rId10"/>
-      <w:footerReference w:type="default" r:id="rId11"/>
+      <w:headerReference w:type="default" r:id="rId12"/>
+      <w:footerReference w:type="default" r:id="rId13"/>
       <w:footnotePr>
         <w:pos w:val="beneathText"/>
       </w:footnotePr>
@@ -10041,6 +10462,119 @@
     </w:lvl>
   </w:abstractNum>
   <w:abstractNum w:abstractNumId="19" w15:restartNumberingAfterBreak="0">
+    <w:nsid w:val="0BAC7D78"/>
+    <w:multiLevelType w:val="hybridMultilevel"/>
+    <w:tmpl w:val="631A52FE"/>
+    <w:lvl w:ilvl="0" w:tplc="300A0001">
+      <w:start w:val="1"/>
+      <w:numFmt w:val="bullet"/>
+      <w:lvlText w:val=""/>
+      <w:lvlJc w:val="left"/>
+      <w:pPr>
+        <w:ind w:left="2225" w:hanging="360"/>
+      </w:pPr>
+      <w:rPr>
+        <w:rFonts w:ascii="Symbol" w:hAnsi="Symbol" w:hint="default"/>
+      </w:rPr>
+    </w:lvl>
+    <w:lvl w:ilvl="1" w:tplc="300A0003" w:tentative="1">
+      <w:start w:val="1"/>
+      <w:numFmt w:val="bullet"/>
+      <w:lvlText w:val="o"/>
+      <w:lvlJc w:val="left"/>
+      <w:pPr>
+        <w:ind w:left="2945" w:hanging="360"/>
+      </w:pPr>
+      <w:rPr>
+        <w:rFonts w:ascii="Courier New" w:hAnsi="Courier New" w:cs="Courier New" w:hint="default"/>
+      </w:rPr>
+    </w:lvl>
+    <w:lvl w:ilvl="2" w:tplc="300A0005" w:tentative="1">
+      <w:start w:val="1"/>
+      <w:numFmt w:val="bullet"/>
+      <w:lvlText w:val=""/>
+      <w:lvlJc w:val="left"/>
+      <w:pPr>
+        <w:ind w:left="3665" w:hanging="360"/>
+      </w:pPr>
+      <w:rPr>
+        <w:rFonts w:ascii="Wingdings" w:hAnsi="Wingdings" w:hint="default"/>
+      </w:rPr>
+    </w:lvl>
+    <w:lvl w:ilvl="3" w:tplc="300A0001" w:tentative="1">
+      <w:start w:val="1"/>
+      <w:numFmt w:val="bullet"/>
+      <w:lvlText w:val=""/>
+      <w:lvlJc w:val="left"/>
+      <w:pPr>
+        <w:ind w:left="4385" w:hanging="360"/>
+      </w:pPr>
+      <w:rPr>
+        <w:rFonts w:ascii="Symbol" w:hAnsi="Symbol" w:hint="default"/>
+      </w:rPr>
+    </w:lvl>
+    <w:lvl w:ilvl="4" w:tplc="300A0003" w:tentative="1">
+      <w:start w:val="1"/>
+      <w:numFmt w:val="bullet"/>
+      <w:lvlText w:val="o"/>
+      <w:lvlJc w:val="left"/>
+      <w:pPr>
+        <w:ind w:left="5105" w:hanging="360"/>
+      </w:pPr>
+      <w:rPr>
+        <w:rFonts w:ascii="Courier New" w:hAnsi="Courier New" w:cs="Courier New" w:hint="default"/>
+      </w:rPr>
+    </w:lvl>
+    <w:lvl w:ilvl="5" w:tplc="300A0005" w:tentative="1">
+      <w:start w:val="1"/>
+      <w:numFmt w:val="bullet"/>
+      <w:lvlText w:val=""/>
+      <w:lvlJc w:val="left"/>
+      <w:pPr>
+        <w:ind w:left="5825" w:hanging="360"/>
+      </w:pPr>
+      <w:rPr>
+        <w:rFonts w:ascii="Wingdings" w:hAnsi="Wingdings" w:hint="default"/>
+      </w:rPr>
+    </w:lvl>
+    <w:lvl w:ilvl="6" w:tplc="300A0001" w:tentative="1">
+      <w:start w:val="1"/>
+      <w:numFmt w:val="bullet"/>
+      <w:lvlText w:val=""/>
+      <w:lvlJc w:val="left"/>
+      <w:pPr>
+        <w:ind w:left="6545" w:hanging="360"/>
+      </w:pPr>
+      <w:rPr>
+        <w:rFonts w:ascii="Symbol" w:hAnsi="Symbol" w:hint="default"/>
+      </w:rPr>
+    </w:lvl>
+    <w:lvl w:ilvl="7" w:tplc="300A0003" w:tentative="1">
+      <w:start w:val="1"/>
+      <w:numFmt w:val="bullet"/>
+      <w:lvlText w:val="o"/>
+      <w:lvlJc w:val="left"/>
+      <w:pPr>
+        <w:ind w:left="7265" w:hanging="360"/>
+      </w:pPr>
+      <w:rPr>
+        <w:rFonts w:ascii="Courier New" w:hAnsi="Courier New" w:cs="Courier New" w:hint="default"/>
+      </w:rPr>
+    </w:lvl>
+    <w:lvl w:ilvl="8" w:tplc="300A0005" w:tentative="1">
+      <w:start w:val="1"/>
+      <w:numFmt w:val="bullet"/>
+      <w:lvlText w:val=""/>
+      <w:lvlJc w:val="left"/>
+      <w:pPr>
+        <w:ind w:left="7985" w:hanging="360"/>
+      </w:pPr>
+      <w:rPr>
+        <w:rFonts w:ascii="Wingdings" w:hAnsi="Wingdings" w:hint="default"/>
+      </w:rPr>
+    </w:lvl>
+  </w:abstractNum>
+  <w:abstractNum w:abstractNumId="20" w15:restartNumberingAfterBreak="0">
     <w:nsid w:val="14540C73"/>
     <w:multiLevelType w:val="multilevel"/>
     <w:tmpl w:val="00000002"/>
@@ -10154,7 +10688,233 @@
       </w:pPr>
     </w:lvl>
   </w:abstractNum>
-  <w:abstractNum w:abstractNumId="20" w15:restartNumberingAfterBreak="0">
+  <w:abstractNum w:abstractNumId="21" w15:restartNumberingAfterBreak="0">
+    <w:nsid w:val="17F00E59"/>
+    <w:multiLevelType w:val="hybridMultilevel"/>
+    <w:tmpl w:val="259AEFCE"/>
+    <w:lvl w:ilvl="0" w:tplc="300A0001">
+      <w:start w:val="1"/>
+      <w:numFmt w:val="bullet"/>
+      <w:lvlText w:val=""/>
+      <w:lvlJc w:val="left"/>
+      <w:pPr>
+        <w:ind w:left="720" w:hanging="360"/>
+      </w:pPr>
+      <w:rPr>
+        <w:rFonts w:ascii="Symbol" w:hAnsi="Symbol" w:hint="default"/>
+      </w:rPr>
+    </w:lvl>
+    <w:lvl w:ilvl="1" w:tplc="300A0003" w:tentative="1">
+      <w:start w:val="1"/>
+      <w:numFmt w:val="bullet"/>
+      <w:lvlText w:val="o"/>
+      <w:lvlJc w:val="left"/>
+      <w:pPr>
+        <w:ind w:left="1440" w:hanging="360"/>
+      </w:pPr>
+      <w:rPr>
+        <w:rFonts w:ascii="Courier New" w:hAnsi="Courier New" w:cs="Courier New" w:hint="default"/>
+      </w:rPr>
+    </w:lvl>
+    <w:lvl w:ilvl="2" w:tplc="300A0005" w:tentative="1">
+      <w:start w:val="1"/>
+      <w:numFmt w:val="bullet"/>
+      <w:lvlText w:val=""/>
+      <w:lvlJc w:val="left"/>
+      <w:pPr>
+        <w:ind w:left="2160" w:hanging="360"/>
+      </w:pPr>
+      <w:rPr>
+        <w:rFonts w:ascii="Wingdings" w:hAnsi="Wingdings" w:hint="default"/>
+      </w:rPr>
+    </w:lvl>
+    <w:lvl w:ilvl="3" w:tplc="300A0001" w:tentative="1">
+      <w:start w:val="1"/>
+      <w:numFmt w:val="bullet"/>
+      <w:lvlText w:val=""/>
+      <w:lvlJc w:val="left"/>
+      <w:pPr>
+        <w:ind w:left="2880" w:hanging="360"/>
+      </w:pPr>
+      <w:rPr>
+        <w:rFonts w:ascii="Symbol" w:hAnsi="Symbol" w:hint="default"/>
+      </w:rPr>
+    </w:lvl>
+    <w:lvl w:ilvl="4" w:tplc="300A0003" w:tentative="1">
+      <w:start w:val="1"/>
+      <w:numFmt w:val="bullet"/>
+      <w:lvlText w:val="o"/>
+      <w:lvlJc w:val="left"/>
+      <w:pPr>
+        <w:ind w:left="3600" w:hanging="360"/>
+      </w:pPr>
+      <w:rPr>
+        <w:rFonts w:ascii="Courier New" w:hAnsi="Courier New" w:cs="Courier New" w:hint="default"/>
+      </w:rPr>
+    </w:lvl>
+    <w:lvl w:ilvl="5" w:tplc="300A0005" w:tentative="1">
+      <w:start w:val="1"/>
+      <w:numFmt w:val="bullet"/>
+      <w:lvlText w:val=""/>
+      <w:lvlJc w:val="left"/>
+      <w:pPr>
+        <w:ind w:left="4320" w:hanging="360"/>
+      </w:pPr>
+      <w:rPr>
+        <w:rFonts w:ascii="Wingdings" w:hAnsi="Wingdings" w:hint="default"/>
+      </w:rPr>
+    </w:lvl>
+    <w:lvl w:ilvl="6" w:tplc="300A0001" w:tentative="1">
+      <w:start w:val="1"/>
+      <w:numFmt w:val="bullet"/>
+      <w:lvlText w:val=""/>
+      <w:lvlJc w:val="left"/>
+      <w:pPr>
+        <w:ind w:left="5040" w:hanging="360"/>
+      </w:pPr>
+      <w:rPr>
+        <w:rFonts w:ascii="Symbol" w:hAnsi="Symbol" w:hint="default"/>
+      </w:rPr>
+    </w:lvl>
+    <w:lvl w:ilvl="7" w:tplc="300A0003" w:tentative="1">
+      <w:start w:val="1"/>
+      <w:numFmt w:val="bullet"/>
+      <w:lvlText w:val="o"/>
+      <w:lvlJc w:val="left"/>
+      <w:pPr>
+        <w:ind w:left="5760" w:hanging="360"/>
+      </w:pPr>
+      <w:rPr>
+        <w:rFonts w:ascii="Courier New" w:hAnsi="Courier New" w:cs="Courier New" w:hint="default"/>
+      </w:rPr>
+    </w:lvl>
+    <w:lvl w:ilvl="8" w:tplc="300A0005" w:tentative="1">
+      <w:start w:val="1"/>
+      <w:numFmt w:val="bullet"/>
+      <w:lvlText w:val=""/>
+      <w:lvlJc w:val="left"/>
+      <w:pPr>
+        <w:ind w:left="6480" w:hanging="360"/>
+      </w:pPr>
+      <w:rPr>
+        <w:rFonts w:ascii="Wingdings" w:hAnsi="Wingdings" w:hint="default"/>
+      </w:rPr>
+    </w:lvl>
+  </w:abstractNum>
+  <w:abstractNum w:abstractNumId="22" w15:restartNumberingAfterBreak="0">
+    <w:nsid w:val="1A933768"/>
+    <w:multiLevelType w:val="hybridMultilevel"/>
+    <w:tmpl w:val="95AE9B26"/>
+    <w:lvl w:ilvl="0" w:tplc="300A0001">
+      <w:start w:val="1"/>
+      <w:numFmt w:val="bullet"/>
+      <w:lvlText w:val=""/>
+      <w:lvlJc w:val="left"/>
+      <w:pPr>
+        <w:ind w:left="720" w:hanging="360"/>
+      </w:pPr>
+      <w:rPr>
+        <w:rFonts w:ascii="Symbol" w:hAnsi="Symbol" w:hint="default"/>
+      </w:rPr>
+    </w:lvl>
+    <w:lvl w:ilvl="1" w:tplc="300A0003" w:tentative="1">
+      <w:start w:val="1"/>
+      <w:numFmt w:val="bullet"/>
+      <w:lvlText w:val="o"/>
+      <w:lvlJc w:val="left"/>
+      <w:pPr>
+        <w:ind w:left="1440" w:hanging="360"/>
+      </w:pPr>
+      <w:rPr>
+        <w:rFonts w:ascii="Courier New" w:hAnsi="Courier New" w:cs="Courier New" w:hint="default"/>
+      </w:rPr>
+    </w:lvl>
+    <w:lvl w:ilvl="2" w:tplc="300A0005" w:tentative="1">
+      <w:start w:val="1"/>
+      <w:numFmt w:val="bullet"/>
+      <w:lvlText w:val=""/>
+      <w:lvlJc w:val="left"/>
+      <w:pPr>
+        <w:ind w:left="2160" w:hanging="360"/>
+      </w:pPr>
+      <w:rPr>
+        <w:rFonts w:ascii="Wingdings" w:hAnsi="Wingdings" w:hint="default"/>
+      </w:rPr>
+    </w:lvl>
+    <w:lvl w:ilvl="3" w:tplc="300A0001" w:tentative="1">
+      <w:start w:val="1"/>
+      <w:numFmt w:val="bullet"/>
+      <w:lvlText w:val=""/>
+      <w:lvlJc w:val="left"/>
+      <w:pPr>
+        <w:ind w:left="2880" w:hanging="360"/>
+      </w:pPr>
+      <w:rPr>
+        <w:rFonts w:ascii="Symbol" w:hAnsi="Symbol" w:hint="default"/>
+      </w:rPr>
+    </w:lvl>
+    <w:lvl w:ilvl="4" w:tplc="300A0003" w:tentative="1">
+      <w:start w:val="1"/>
+      <w:numFmt w:val="bullet"/>
+      <w:lvlText w:val="o"/>
+      <w:lvlJc w:val="left"/>
+      <w:pPr>
+        <w:ind w:left="3600" w:hanging="360"/>
+      </w:pPr>
+      <w:rPr>
+        <w:rFonts w:ascii="Courier New" w:hAnsi="Courier New" w:cs="Courier New" w:hint="default"/>
+      </w:rPr>
+    </w:lvl>
+    <w:lvl w:ilvl="5" w:tplc="300A0005" w:tentative="1">
+      <w:start w:val="1"/>
+      <w:numFmt w:val="bullet"/>
+      <w:lvlText w:val=""/>
+      <w:lvlJc w:val="left"/>
+      <w:pPr>
+        <w:ind w:left="4320" w:hanging="360"/>
+      </w:pPr>
+      <w:rPr>
+        <w:rFonts w:ascii="Wingdings" w:hAnsi="Wingdings" w:hint="default"/>
+      </w:rPr>
+    </w:lvl>
+    <w:lvl w:ilvl="6" w:tplc="300A0001" w:tentative="1">
+      <w:start w:val="1"/>
+      <w:numFmt w:val="bullet"/>
+      <w:lvlText w:val=""/>
+      <w:lvlJc w:val="left"/>
+      <w:pPr>
+        <w:ind w:left="5040" w:hanging="360"/>
+      </w:pPr>
+      <w:rPr>
+        <w:rFonts w:ascii="Symbol" w:hAnsi="Symbol" w:hint="default"/>
+      </w:rPr>
+    </w:lvl>
+    <w:lvl w:ilvl="7" w:tplc="300A0003" w:tentative="1">
+      <w:start w:val="1"/>
+      <w:numFmt w:val="bullet"/>
+      <w:lvlText w:val="o"/>
+      <w:lvlJc w:val="left"/>
+      <w:pPr>
+        <w:ind w:left="5760" w:hanging="360"/>
+      </w:pPr>
+      <w:rPr>
+        <w:rFonts w:ascii="Courier New" w:hAnsi="Courier New" w:cs="Courier New" w:hint="default"/>
+      </w:rPr>
+    </w:lvl>
+    <w:lvl w:ilvl="8" w:tplc="300A0005" w:tentative="1">
+      <w:start w:val="1"/>
+      <w:numFmt w:val="bullet"/>
+      <w:lvlText w:val=""/>
+      <w:lvlJc w:val="left"/>
+      <w:pPr>
+        <w:ind w:left="6480" w:hanging="360"/>
+      </w:pPr>
+      <w:rPr>
+        <w:rFonts w:ascii="Wingdings" w:hAnsi="Wingdings" w:hint="default"/>
+      </w:rPr>
+    </w:lvl>
+  </w:abstractNum>
+  <w:abstractNum w:abstractNumId="23" w15:restartNumberingAfterBreak="0">
     <w:nsid w:val="22C234E1"/>
     <w:multiLevelType w:val="hybridMultilevel"/>
     <w:tmpl w:val="BF5479E4"/>
@@ -10267,7 +11027,120 @@
       </w:rPr>
     </w:lvl>
   </w:abstractNum>
-  <w:abstractNum w:abstractNumId="21" w15:restartNumberingAfterBreak="0">
+  <w:abstractNum w:abstractNumId="24" w15:restartNumberingAfterBreak="0">
+    <w:nsid w:val="43C47DDD"/>
+    <w:multiLevelType w:val="hybridMultilevel"/>
+    <w:tmpl w:val="9DD689A6"/>
+    <w:lvl w:ilvl="0" w:tplc="300A0001">
+      <w:start w:val="1"/>
+      <w:numFmt w:val="bullet"/>
+      <w:lvlText w:val=""/>
+      <w:lvlJc w:val="left"/>
+      <w:pPr>
+        <w:ind w:left="2225" w:hanging="360"/>
+      </w:pPr>
+      <w:rPr>
+        <w:rFonts w:ascii="Symbol" w:hAnsi="Symbol" w:hint="default"/>
+      </w:rPr>
+    </w:lvl>
+    <w:lvl w:ilvl="1" w:tplc="300A0003" w:tentative="1">
+      <w:start w:val="1"/>
+      <w:numFmt w:val="bullet"/>
+      <w:lvlText w:val="o"/>
+      <w:lvlJc w:val="left"/>
+      <w:pPr>
+        <w:ind w:left="2945" w:hanging="360"/>
+      </w:pPr>
+      <w:rPr>
+        <w:rFonts w:ascii="Courier New" w:hAnsi="Courier New" w:cs="Courier New" w:hint="default"/>
+      </w:rPr>
+    </w:lvl>
+    <w:lvl w:ilvl="2" w:tplc="300A0005" w:tentative="1">
+      <w:start w:val="1"/>
+      <w:numFmt w:val="bullet"/>
+      <w:lvlText w:val=""/>
+      <w:lvlJc w:val="left"/>
+      <w:pPr>
+        <w:ind w:left="3665" w:hanging="360"/>
+      </w:pPr>
+      <w:rPr>
+        <w:rFonts w:ascii="Wingdings" w:hAnsi="Wingdings" w:hint="default"/>
+      </w:rPr>
+    </w:lvl>
+    <w:lvl w:ilvl="3" w:tplc="300A0001" w:tentative="1">
+      <w:start w:val="1"/>
+      <w:numFmt w:val="bullet"/>
+      <w:lvlText w:val=""/>
+      <w:lvlJc w:val="left"/>
+      <w:pPr>
+        <w:ind w:left="4385" w:hanging="360"/>
+      </w:pPr>
+      <w:rPr>
+        <w:rFonts w:ascii="Symbol" w:hAnsi="Symbol" w:hint="default"/>
+      </w:rPr>
+    </w:lvl>
+    <w:lvl w:ilvl="4" w:tplc="300A0003" w:tentative="1">
+      <w:start w:val="1"/>
+      <w:numFmt w:val="bullet"/>
+      <w:lvlText w:val="o"/>
+      <w:lvlJc w:val="left"/>
+      <w:pPr>
+        <w:ind w:left="5105" w:hanging="360"/>
+      </w:pPr>
+      <w:rPr>
+        <w:rFonts w:ascii="Courier New" w:hAnsi="Courier New" w:cs="Courier New" w:hint="default"/>
+      </w:rPr>
+    </w:lvl>
+    <w:lvl w:ilvl="5" w:tplc="300A0005" w:tentative="1">
+      <w:start w:val="1"/>
+      <w:numFmt w:val="bullet"/>
+      <w:lvlText w:val=""/>
+      <w:lvlJc w:val="left"/>
+      <w:pPr>
+        <w:ind w:left="5825" w:hanging="360"/>
+      </w:pPr>
+      <w:rPr>
+        <w:rFonts w:ascii="Wingdings" w:hAnsi="Wingdings" w:hint="default"/>
+      </w:rPr>
+    </w:lvl>
+    <w:lvl w:ilvl="6" w:tplc="300A0001" w:tentative="1">
+      <w:start w:val="1"/>
+      <w:numFmt w:val="bullet"/>
+      <w:lvlText w:val=""/>
+      <w:lvlJc w:val="left"/>
+      <w:pPr>
+        <w:ind w:left="6545" w:hanging="360"/>
+      </w:pPr>
+      <w:rPr>
+        <w:rFonts w:ascii="Symbol" w:hAnsi="Symbol" w:hint="default"/>
+      </w:rPr>
+    </w:lvl>
+    <w:lvl w:ilvl="7" w:tplc="300A0003" w:tentative="1">
+      <w:start w:val="1"/>
+      <w:numFmt w:val="bullet"/>
+      <w:lvlText w:val="o"/>
+      <w:lvlJc w:val="left"/>
+      <w:pPr>
+        <w:ind w:left="7265" w:hanging="360"/>
+      </w:pPr>
+      <w:rPr>
+        <w:rFonts w:ascii="Courier New" w:hAnsi="Courier New" w:cs="Courier New" w:hint="default"/>
+      </w:rPr>
+    </w:lvl>
+    <w:lvl w:ilvl="8" w:tplc="300A0005" w:tentative="1">
+      <w:start w:val="1"/>
+      <w:numFmt w:val="bullet"/>
+      <w:lvlText w:val=""/>
+      <w:lvlJc w:val="left"/>
+      <w:pPr>
+        <w:ind w:left="7985" w:hanging="360"/>
+      </w:pPr>
+      <w:rPr>
+        <w:rFonts w:ascii="Wingdings" w:hAnsi="Wingdings" w:hint="default"/>
+      </w:rPr>
+    </w:lvl>
+  </w:abstractNum>
+  <w:abstractNum w:abstractNumId="25" w15:restartNumberingAfterBreak="0">
     <w:nsid w:val="4DD94E23"/>
     <w:multiLevelType w:val="hybridMultilevel"/>
     <w:tmpl w:val="B178EA20"/>
@@ -10380,7 +11253,7 @@
       </w:rPr>
     </w:lvl>
   </w:abstractNum>
-  <w:abstractNum w:abstractNumId="22" w15:restartNumberingAfterBreak="0">
+  <w:abstractNum w:abstractNumId="26" w15:restartNumberingAfterBreak="0">
     <w:nsid w:val="4ECB0A63"/>
     <w:multiLevelType w:val="hybridMultilevel"/>
     <w:tmpl w:val="65A84DD6"/>
@@ -10469,7 +11342,7 @@
       </w:pPr>
     </w:lvl>
   </w:abstractNum>
-  <w:abstractNum w:abstractNumId="23" w15:restartNumberingAfterBreak="0">
+  <w:abstractNum w:abstractNumId="27" w15:restartNumberingAfterBreak="0">
     <w:nsid w:val="4FC86E15"/>
     <w:multiLevelType w:val="hybridMultilevel"/>
     <w:tmpl w:val="E8362110"/>
@@ -10582,7 +11455,7 @@
       </w:rPr>
     </w:lvl>
   </w:abstractNum>
-  <w:abstractNum w:abstractNumId="24" w15:restartNumberingAfterBreak="0">
+  <w:abstractNum w:abstractNumId="28" w15:restartNumberingAfterBreak="0">
     <w:nsid w:val="51711C76"/>
     <w:multiLevelType w:val="hybridMultilevel"/>
     <w:tmpl w:val="040A51F2"/>
@@ -10695,7 +11568,7 @@
       </w:rPr>
     </w:lvl>
   </w:abstractNum>
-  <w:abstractNum w:abstractNumId="25" w15:restartNumberingAfterBreak="0">
+  <w:abstractNum w:abstractNumId="29" w15:restartNumberingAfterBreak="0">
     <w:nsid w:val="592D6892"/>
     <w:multiLevelType w:val="hybridMultilevel"/>
     <w:tmpl w:val="103ADFD6"/>
@@ -10808,7 +11681,7 @@
       </w:rPr>
     </w:lvl>
   </w:abstractNum>
-  <w:abstractNum w:abstractNumId="26" w15:restartNumberingAfterBreak="0">
+  <w:abstractNum w:abstractNumId="30" w15:restartNumberingAfterBreak="0">
     <w:nsid w:val="6B3A64A5"/>
     <w:multiLevelType w:val="hybridMultilevel"/>
     <w:tmpl w:val="D6B2F6BC"/>
@@ -10921,7 +11794,7 @@
       </w:rPr>
     </w:lvl>
   </w:abstractNum>
-  <w:abstractNum w:abstractNumId="27" w15:restartNumberingAfterBreak="0">
+  <w:abstractNum w:abstractNumId="31" w15:restartNumberingAfterBreak="0">
     <w:nsid w:val="6D2E4C70"/>
     <w:multiLevelType w:val="hybridMultilevel"/>
     <w:tmpl w:val="D65C3E74"/>
@@ -11034,7 +11907,7 @@
       </w:rPr>
     </w:lvl>
   </w:abstractNum>
-  <w:abstractNum w:abstractNumId="28" w15:restartNumberingAfterBreak="0">
+  <w:abstractNum w:abstractNumId="32" w15:restartNumberingAfterBreak="0">
     <w:nsid w:val="71227B55"/>
     <w:multiLevelType w:val="hybridMultilevel"/>
     <w:tmpl w:val="86F28D78"/>
@@ -11146,7 +12019,7 @@
       </w:rPr>
     </w:lvl>
   </w:abstractNum>
-  <w:abstractNum w:abstractNumId="29" w15:restartNumberingAfterBreak="0">
+  <w:abstractNum w:abstractNumId="33" w15:restartNumberingAfterBreak="0">
     <w:nsid w:val="72724301"/>
     <w:multiLevelType w:val="hybridMultilevel"/>
     <w:tmpl w:val="9CF4E02E"/>
@@ -11266,40 +12139,52 @@
     <w:abstractNumId w:val="7"/>
   </w:num>
   <w:num w:numId="3">
-    <w:abstractNumId w:val="22"/>
+    <w:abstractNumId w:val="26"/>
   </w:num>
   <w:num w:numId="4">
-    <w:abstractNumId w:val="26"/>
+    <w:abstractNumId w:val="30"/>
   </w:num>
   <w:num w:numId="5">
-    <w:abstractNumId w:val="28"/>
+    <w:abstractNumId w:val="32"/>
   </w:num>
   <w:num w:numId="6">
-    <w:abstractNumId w:val="27"/>
+    <w:abstractNumId w:val="31"/>
   </w:num>
   <w:num w:numId="7">
     <w:abstractNumId w:val="18"/>
   </w:num>
   <w:num w:numId="8">
-    <w:abstractNumId w:val="20"/>
+    <w:abstractNumId w:val="23"/>
   </w:num>
   <w:num w:numId="9">
-    <w:abstractNumId w:val="29"/>
+    <w:abstractNumId w:val="33"/>
   </w:num>
   <w:num w:numId="10">
     <w:abstractNumId w:val="17"/>
   </w:num>
   <w:num w:numId="11">
+    <w:abstractNumId w:val="29"/>
+  </w:num>
+  <w:num w:numId="12">
+    <w:abstractNumId w:val="27"/>
+  </w:num>
+  <w:num w:numId="13">
+    <w:abstractNumId w:val="28"/>
+  </w:num>
+  <w:num w:numId="14">
     <w:abstractNumId w:val="25"/>
   </w:num>
-  <w:num w:numId="12">
-    <w:abstractNumId w:val="23"/>
+  <w:num w:numId="15">
+    <w:abstractNumId w:val="21"/>
   </w:num>
-  <w:num w:numId="13">
+  <w:num w:numId="16">
+    <w:abstractNumId w:val="19"/>
+  </w:num>
+  <w:num w:numId="17">
     <w:abstractNumId w:val="24"/>
   </w:num>
-  <w:num w:numId="14">
-    <w:abstractNumId w:val="21"/>
+  <w:num w:numId="18">
+    <w:abstractNumId w:val="22"/>
   </w:num>
   <w:numIdMacAtCleanup w:val="6"/>
 </w:numbering>
@@ -11810,7 +12695,6 @@
   <w:style w:type="character" w:default="1" w:styleId="Fuentedeprrafopredeter">
     <w:name w:val="Default Paragraph Font"/>
     <w:uiPriority w:val="1"/>
-    <w:semiHidden/>
     <w:unhideWhenUsed/>
   </w:style>
   <w:style w:type="table" w:default="1" w:styleId="Tablanormal">
@@ -12774,6 +13658,78 @@
       <w:bCs/>
     </w:rPr>
   </w:style>
+  <w:style w:type="table" w:styleId="Tablaconcuadrcula2-nfasis1">
+    <w:name w:val="Grid Table 2 Accent 1"/>
+    <w:basedOn w:val="Tablanormal"/>
+    <w:uiPriority w:val="47"/>
+    <w:rsid w:val="005A2C08"/>
+    <w:tblPr>
+      <w:tblStyleRowBandSize w:val="1"/>
+      <w:tblStyleColBandSize w:val="1"/>
+      <w:tblBorders>
+        <w:top w:val="single" w:sz="2" w:space="0" w:color="8EAADB" w:themeColor="accent1" w:themeTint="99"/>
+        <w:bottom w:val="single" w:sz="2" w:space="0" w:color="8EAADB" w:themeColor="accent1" w:themeTint="99"/>
+        <w:insideH w:val="single" w:sz="2" w:space="0" w:color="8EAADB" w:themeColor="accent1" w:themeTint="99"/>
+        <w:insideV w:val="single" w:sz="2" w:space="0" w:color="8EAADB" w:themeColor="accent1" w:themeTint="99"/>
+      </w:tblBorders>
+    </w:tblPr>
+    <w:tblStylePr w:type="firstRow">
+      <w:rPr>
+        <w:b/>
+        <w:bCs/>
+      </w:rPr>
+      <w:tblPr/>
+      <w:tcPr>
+        <w:tcBorders>
+          <w:top w:val="nil"/>
+          <w:bottom w:val="single" w:sz="12" w:space="0" w:color="8EAADB" w:themeColor="accent1" w:themeTint="99"/>
+          <w:insideH w:val="nil"/>
+          <w:insideV w:val="nil"/>
+        </w:tcBorders>
+        <w:shd w:val="clear" w:color="auto" w:fill="FFFFFF" w:themeFill="background1"/>
+      </w:tcPr>
+    </w:tblStylePr>
+    <w:tblStylePr w:type="lastRow">
+      <w:rPr>
+        <w:b/>
+        <w:bCs/>
+      </w:rPr>
+      <w:tblPr/>
+      <w:tcPr>
+        <w:tcBorders>
+          <w:top w:val="double" w:sz="2" w:space="0" w:color="8EAADB" w:themeColor="accent1" w:themeTint="99"/>
+          <w:bottom w:val="nil"/>
+          <w:insideH w:val="nil"/>
+          <w:insideV w:val="nil"/>
+        </w:tcBorders>
+        <w:shd w:val="clear" w:color="auto" w:fill="FFFFFF" w:themeFill="background1"/>
+      </w:tcPr>
+    </w:tblStylePr>
+    <w:tblStylePr w:type="firstCol">
+      <w:rPr>
+        <w:b/>
+        <w:bCs/>
+      </w:rPr>
+    </w:tblStylePr>
+    <w:tblStylePr w:type="lastCol">
+      <w:rPr>
+        <w:b/>
+        <w:bCs/>
+      </w:rPr>
+    </w:tblStylePr>
+    <w:tblStylePr w:type="band1Vert">
+      <w:tblPr/>
+      <w:tcPr>
+        <w:shd w:val="clear" w:color="auto" w:fill="D9E2F3" w:themeFill="accent1" w:themeFillTint="33"/>
+      </w:tcPr>
+    </w:tblStylePr>
+    <w:tblStylePr w:type="band1Horz">
+      <w:tblPr/>
+      <w:tcPr>
+        <w:shd w:val="clear" w:color="auto" w:fill="D9E2F3" w:themeFill="accent1" w:themeFillTint="33"/>
+      </w:tcPr>
+    </w:tblStylePr>
+  </w:style>
 </w:styles>
 </file>
 

</xml_diff>